<commit_message>
feat: implement Streamlit-based offer letter generation application with custom glassmorphism styling
</commit_message>
<xml_diff>
--- a/_Vibrant tech lab - kishan , hetansh.docx
+++ b/_Vibrant tech lab - kishan , hetansh.docx
@@ -1,6 +1,6 @@
 
 <file path=word/document.xml><?xml version="1.0" encoding="utf-8"?>
-<w:document xmlns:wpc="http://schemas.microsoft.com/office/word/2010/wordprocessingCanvas" xmlns:mc="http://schemas.openxmlformats.org/markup-compatibility/2006" xmlns:o="urn:schemas-microsoft-com:office:office" xmlns:r="http://schemas.openxmlformats.org/officeDocument/2006/relationships" xmlns:m="http://schemas.openxmlformats.org/officeDocument/2006/math" xmlns:v="urn:schemas-microsoft-com:vml" xmlns:wp14="http://schemas.microsoft.com/office/word/2010/wordprocessingDrawing" xmlns:wp="http://schemas.openxmlformats.org/drawingml/2006/wordprocessingDrawing" xmlns:w10="urn:schemas-microsoft-com:office:word" xmlns:w="http://schemas.openxmlformats.org/wordprocessingml/2006/main" xmlns:w14="http://schemas.microsoft.com/office/word/2010/wordml" xmlns:wpg="http://schemas.microsoft.com/office/word/2010/wordprocessingGroup" xmlns:wpi="http://schemas.microsoft.com/office/word/2010/wordprocessingInk" xmlns:wne="http://schemas.microsoft.com/office/word/2006/wordml" xmlns:wps="http://schemas.microsoft.com/office/word/2010/wordprocessingShape" mc:Ignorable="w14 wp14">
+<w:document xmlns:wpc="http://schemas.microsoft.com/office/word/2010/wordprocessingCanvas" xmlns:cx="http://schemas.microsoft.com/office/drawing/2014/chartex" xmlns:cx1="http://schemas.microsoft.com/office/drawing/2015/9/8/chartex" xmlns:cx2="http://schemas.microsoft.com/office/drawing/2015/10/21/chartex" xmlns:cx3="http://schemas.microsoft.com/office/drawing/2016/5/9/chartex" xmlns:cx4="http://schemas.microsoft.com/office/drawing/2016/5/10/chartex" xmlns:cx5="http://schemas.microsoft.com/office/drawing/2016/5/11/chartex" xmlns:cx6="http://schemas.microsoft.com/office/drawing/2016/5/12/chartex" xmlns:cx7="http://schemas.microsoft.com/office/drawing/2016/5/13/chartex" xmlns:cx8="http://schemas.microsoft.com/office/drawing/2016/5/14/chartex" xmlns:mc="http://schemas.openxmlformats.org/markup-compatibility/2006" xmlns:aink="http://schemas.microsoft.com/office/drawing/2016/ink" xmlns:am3d="http://schemas.microsoft.com/office/drawing/2017/model3d" xmlns:o="urn:schemas-microsoft-com:office:office" xmlns:oel="http://schemas.microsoft.com/office/2019/extlst" xmlns:r="http://schemas.openxmlformats.org/officeDocument/2006/relationships" xmlns:m="http://schemas.openxmlformats.org/officeDocument/2006/math" xmlns:v="urn:schemas-microsoft-com:vml" xmlns:wp14="http://schemas.microsoft.com/office/word/2010/wordprocessingDrawing" xmlns:wp="http://schemas.openxmlformats.org/drawingml/2006/wordprocessingDrawing" xmlns:w10="urn:schemas-microsoft-com:office:word" xmlns:w="http://schemas.openxmlformats.org/wordprocessingml/2006/main" xmlns:w14="http://schemas.microsoft.com/office/word/2010/wordml" xmlns:w15="http://schemas.microsoft.com/office/word/2012/wordml" xmlns:w16cex="http://schemas.microsoft.com/office/word/2018/wordml/cex" xmlns:w16cid="http://schemas.microsoft.com/office/word/2016/wordml/cid" xmlns:w16="http://schemas.microsoft.com/office/word/2018/wordml" xmlns:w16sdtdh="http://schemas.microsoft.com/office/word/2020/wordml/sdtdatahash" xmlns:w16se="http://schemas.microsoft.com/office/word/2015/wordml/symex" xmlns:wpg="http://schemas.microsoft.com/office/word/2010/wordprocessingGroup" xmlns:wpi="http://schemas.microsoft.com/office/word/2010/wordprocessingInk" xmlns:wne="http://schemas.microsoft.com/office/word/2006/wordml" xmlns:wps="http://schemas.microsoft.com/office/word/2010/wordprocessingShape" mc:Ignorable="w14 w15 w16se w16cid w16 w16cex w16sdtdh wp14">
   <w:body>
     <w:p>
       <w:pPr>
@@ -55,7 +55,7 @@
           <w:lang w:val="en-IN" w:eastAsia="en-IN"/>
         </w:rPr>
         <w:drawing>
-          <wp:inline distT="0" distB="0" distL="0" distR="0">
+          <wp:inline distT="0" distB="0" distL="0" distR="0" wp14:anchorId="1D2D5892" wp14:editId="1D2D5893">
             <wp:extent cx="233362" cy="233362"/>
             <wp:effectExtent l="0" t="0" r="0" b="0"/>
             <wp:docPr id="1" name="Image 1"/>
@@ -70,7 +70,7 @@
                     <pic:cNvPicPr/>
                   </pic:nvPicPr>
                   <pic:blipFill>
-                    <a:blip r:embed="rId5" cstate="print"/>
+                    <a:blip r:embed="rId4" cstate="print"/>
                     <a:stretch>
                       <a:fillRect/>
                     </a:stretch>
@@ -108,7 +108,7 @@
           <w:lang w:val="en-IN" w:eastAsia="en-IN"/>
         </w:rPr>
         <w:drawing>
-          <wp:anchor distT="0" distB="0" distL="0" distR="0" simplePos="0" relativeHeight="487587840" behindDoc="1" locked="0" layoutInCell="1" allowOverlap="1">
+          <wp:anchor distT="0" distB="0" distL="0" distR="0" simplePos="0" relativeHeight="487587840" behindDoc="1" locked="0" layoutInCell="1" allowOverlap="1" wp14:anchorId="1D2D5894" wp14:editId="1D2D5895">
             <wp:simplePos x="0" y="0"/>
             <wp:positionH relativeFrom="page">
               <wp:posOffset>4953765</wp:posOffset>
@@ -131,7 +131,7 @@
                     <pic:cNvPicPr/>
                   </pic:nvPicPr>
                   <pic:blipFill>
-                    <a:blip r:embed="rId6" cstate="print"/>
+                    <a:blip r:embed="rId5" cstate="print"/>
                     <a:stretch>
                       <a:fillRect/>
                     </a:stretch>
@@ -192,11 +192,10 @@
           <w:noProof/>
           <w:lang w:val="en-IN" w:eastAsia="en-IN"/>
         </w:rPr>
-        <w:lastRenderedPageBreak/>
         <mc:AlternateContent>
-          <mc:Choice Requires="wps">
+          <mc:Choice Requires="wpg">
             <w:drawing>
-              <wp:anchor distT="0" distB="0" distL="0" distR="0" simplePos="0" relativeHeight="487520256" behindDoc="1" locked="0" layoutInCell="1" allowOverlap="1">
+              <wp:anchor distT="0" distB="0" distL="0" distR="0" simplePos="0" relativeHeight="487520256" behindDoc="1" locked="0" layoutInCell="1" allowOverlap="1" wp14:anchorId="1D2D5896" wp14:editId="1D2D5897">
                 <wp:simplePos x="0" y="0"/>
                 <wp:positionH relativeFrom="page">
                   <wp:posOffset>681582</wp:posOffset>
@@ -270,7 +269,7 @@
                           <pic:cNvPicPr/>
                         </pic:nvPicPr>
                         <pic:blipFill>
-                          <a:blip r:embed="rId7" cstate="print"/>
+                          <a:blip r:embed="rId6" cstate="print"/>
                           <a:stretch>
                             <a:fillRect/>
                           </a:stretch>
@@ -401,45 +400,78 @@
               </wp:anchor>
             </w:drawing>
           </mc:Choice>
-          <mc:Fallback xmlns:pic="http://schemas.openxmlformats.org/drawingml/2006/picture" xmlns:a="http://schemas.openxmlformats.org/drawingml/2006/main" xmlns:ve="http://schemas.openxmlformats.org/markup-compatibility/2006">
+          <mc:Fallback>
             <w:pict>
-              <v:group style="position:absolute;margin-left:53.667942pt;margin-top:-77.301956pt;width:512.8pt;height:68.650pt;mso-position-horizontal-relative:page;mso-position-vertical-relative:paragraph;z-index:-15796224" id="docshapegroup1" coordorigin="1073,-1546" coordsize="10256,1373">
-                <v:line style="position:absolute" from="1073,-181" to="11328,-181" stroked="true" strokeweight=".750283pt" strokecolor="#000000">
-                  <v:stroke dashstyle="solid"/>
-                </v:line>
-                <v:shape style="position:absolute;left:1073;top:-1547;width:3272;height:1291" type="#_x0000_t75" id="docshape2" stroked="false">
-                  <v:imagedata r:id="rId8" o:title=""/>
+              <v:group w14:anchorId="1D2D5896" id="Group 3" o:spid="_x0000_s1026" style="position:absolute;left:0;text-align:left;margin-left:53.65pt;margin-top:-77.3pt;width:512.8pt;height:68.65pt;z-index:-15796224;mso-wrap-distance-left:0;mso-wrap-distance-right:0;mso-position-horizontal-relative:page" coordsize="65125,8718" o:gfxdata="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">
+                <v:shape id="Graphic 4" o:spid="_x0000_s1027" style="position:absolute;top:8666;width:65125;height:13;visibility:visible;mso-wrap-style:square;v-text-anchor:top" coordsize="6512559,1270" o:gfxdata="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" path="m,l6511951,e" filled="f" strokeweight=".26467mm">
+                  <v:path arrowok="t"/>
                 </v:shape>
-                <v:shapetype id="_x0000_t202" o:spt="202" coordsize="21600,21600" path="m,l,21600r21600,l21600,xe">
+                <v:shapetype id="_x0000_t75" coordsize="21600,21600" o:spt="75" o:preferrelative="t" path="m@4@5l@4@11@9@11@9@5xe" filled="f" stroked="f">
+                  <v:stroke joinstyle="miter"/>
+                  <v:formulas>
+                    <v:f eqn="if lineDrawn pixelLineWidth 0"/>
+                    <v:f eqn="sum @0 1 0"/>
+                    <v:f eqn="sum 0 0 @1"/>
+                    <v:f eqn="prod @2 1 2"/>
+                    <v:f eqn="prod @3 21600 pixelWidth"/>
+                    <v:f eqn="prod @3 21600 pixelHeight"/>
+                    <v:f eqn="sum @0 0 1"/>
+                    <v:f eqn="prod @6 1 2"/>
+                    <v:f eqn="prod @7 21600 pixelWidth"/>
+                    <v:f eqn="sum @8 21600 0"/>
+                    <v:f eqn="prod @7 21600 pixelHeight"/>
+                    <v:f eqn="sum @10 21600 0"/>
+                  </v:formulas>
+                  <v:path o:extrusionok="f" gradientshapeok="t" o:connecttype="rect"/>
+                  <o:lock v:ext="edit" aspectratio="t"/>
+                </v:shapetype>
+                <v:shape id="Image 5" o:spid="_x0000_s1028" type="#_x0000_t75" style="position:absolute;width:20772;height:8194;visibility:visible;mso-wrap-style:square" o:gfxdata="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">
+                  <v:imagedata r:id="rId7" o:title=""/>
+                </v:shape>
+                <v:shapetype id="_x0000_t202" coordsize="21600,21600" o:spt="202" path="m,l,21600r21600,l21600,xe">
                   <v:stroke joinstyle="miter"/>
                   <v:path gradientshapeok="t" o:connecttype="rect"/>
                 </v:shapetype>
-                <v:shape style="position:absolute;left:1073;top:-1547;width:10256;height:1373" type="#_x0000_t202" id="docshape3" filled="false" stroked="false">
+                <v:shape id="Textbox 6" o:spid="_x0000_s1029" type="#_x0000_t202" style="position:absolute;width:65125;height:8718;visibility:visible;mso-wrap-style:square;v-text-anchor:top" o:gfxdata="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" filled="f" stroked="f">
                   <v:textbox inset="0,0,0,0">
                     <w:txbxContent>
                       <w:p>
                         <w:pPr>
                           <w:spacing w:before="250"/>
-                          <w:ind w:left="7263" w:right="0" w:firstLine="0"/>
-                          <w:jc w:val="left"/>
+                          <w:ind w:left="7263"/>
                           <w:rPr>
                             <w:sz w:val="24"/>
                           </w:rPr>
                         </w:pPr>
-                        <w:hyperlink r:id="rId9">
-                          <w:r>
-                            <w:rPr>
-                              <w:spacing w:val="-2"/>
-                              <w:w w:val="115"/>
-                              <w:sz w:val="24"/>
-                            </w:rPr>
-                            <w:t>www.vibranttechlab.in</w:t>
-                          </w:r>
-                        </w:hyperlink>
+                        <w:r>
+                          <w:fldChar w:fldCharType="begin"/>
+                        </w:r>
+                        <w:r>
+                          <w:instrText xml:space="preserve"> HYPERLINK "http://www.vibranttechlab.in/" \h </w:instrText>
+                        </w:r>
+                        <w:r>
+                          <w:fldChar w:fldCharType="separate"/>
+                        </w:r>
+                        <w:r>
+                          <w:rPr>
+                            <w:spacing w:val="-2"/>
+                            <w:w w:val="115"/>
+                            <w:sz w:val="24"/>
+                          </w:rPr>
+                          <w:t>www.vibranttechlab.in</w:t>
+                        </w:r>
+                        <w:r>
+                          <w:rPr>
+                            <w:spacing w:val="-2"/>
+                            <w:w w:val="115"/>
+                            <w:sz w:val="24"/>
+                          </w:rPr>
+                          <w:fldChar w:fldCharType="end"/>
+                        </w:r>
                       </w:p>
                       <w:p>
                         <w:pPr>
-                          <w:spacing w:line="240" w:lineRule="auto" w:before="44"/>
+                          <w:spacing w:before="44"/>
                           <w:rPr>
                             <w:sz w:val="24"/>
                           </w:rPr>
@@ -447,9 +479,7 @@
                       </w:p>
                       <w:p>
                         <w:pPr>
-                          <w:spacing w:before="0"/>
-                          <w:ind w:left="7253" w:right="0" w:firstLine="0"/>
-                          <w:jc w:val="left"/>
+                          <w:ind w:left="7253"/>
                           <w:rPr>
                             <w:sz w:val="24"/>
                           </w:rPr>
@@ -468,7 +498,7 @@
                             <w:w w:val="105"/>
                             <w:sz w:val="24"/>
                           </w:rPr>
-                          <w:t> </w:t>
+                          <w:t xml:space="preserve"> </w:t>
                         </w:r>
                         <w:r>
                           <w:rPr>
@@ -484,7 +514,7 @@
                             <w:w w:val="105"/>
                             <w:sz w:val="24"/>
                           </w:rPr>
-                          <w:t> </w:t>
+                          <w:t xml:space="preserve"> </w:t>
                         </w:r>
                         <w:r>
                           <w:rPr>
@@ -497,9 +527,8 @@
                       </w:p>
                     </w:txbxContent>
                   </v:textbox>
-                  <w10:wrap type="none"/>
                 </v:shape>
-                <w10:wrap type="none"/>
+                <w10:wrap anchorx="page"/>
               </v:group>
             </w:pict>
           </mc:Fallback>
@@ -560,21 +589,28 @@
           <w:sz w:val="24"/>
         </w:rPr>
       </w:pPr>
-      <w:proofErr w:type="gramStart"/>
       <w:r>
         <w:rPr>
           <w:w w:val="110"/>
           <w:sz w:val="24"/>
         </w:rPr>
-        <w:t>President Institute Of Computer Application.</w:t>
-      </w:r>
-      <w:proofErr w:type="gramEnd"/>
+        <w:t xml:space="preserve">President Institute </w:t>
+      </w:r>
+      <w:proofErr w:type="gramStart"/>
       <w:r>
         <w:rPr>
           <w:w w:val="110"/>
           <w:sz w:val="24"/>
         </w:rPr>
-        <w:t xml:space="preserve"> </w:t>
+        <w:t>Of</w:t>
+      </w:r>
+      <w:proofErr w:type="gramEnd"/>
+      <w:r>
+        <w:rPr>
+          <w:w w:val="110"/>
+          <w:sz w:val="24"/>
+        </w:rPr>
+        <w:t xml:space="preserve"> Computer Application. </w:t>
       </w:r>
       <w:proofErr w:type="spellStart"/>
       <w:r>
@@ -781,11 +817,10 @@
           <w:sz w:val="24"/>
           <w:lang w:val="en-IN" w:eastAsia="en-IN"/>
         </w:rPr>
-        <w:lastRenderedPageBreak/>
         <mc:AlternateContent>
-          <mc:Choice Requires="wps">
+          <mc:Choice Requires="wpg">
             <w:drawing>
-              <wp:anchor distT="0" distB="0" distL="0" distR="0" simplePos="0" relativeHeight="15731200" behindDoc="0" locked="0" layoutInCell="1" allowOverlap="1">
+              <wp:anchor distT="0" distB="0" distL="0" distR="0" simplePos="0" relativeHeight="15731200" behindDoc="0" locked="0" layoutInCell="1" allowOverlap="1" wp14:anchorId="1D2D5898" wp14:editId="1D2D5899">
                 <wp:simplePos x="0" y="0"/>
                 <wp:positionH relativeFrom="page">
                   <wp:posOffset>0</wp:posOffset>
@@ -1019,7 +1054,7 @@
                           <pic:cNvPicPr/>
                         </pic:nvPicPr>
                         <pic:blipFill>
-                          <a:blip r:embed="rId10" cstate="print"/>
+                          <a:blip r:embed="rId8" cstate="print"/>
                           <a:stretch>
                             <a:fillRect/>
                           </a:stretch>
@@ -1309,7 +1344,7 @@
                                   <w:color w:val="595959"/>
                                   <w:sz w:val="20"/>
                                 </w:rPr>
-                                <w:t>801-SiliconTower</w:t>
+                                <w:t>801-</w:t>
                               </w:r>
                               <w:proofErr w:type="gramStart"/>
                               <w:r>
@@ -1318,7 +1353,7 @@
                                   <w:color w:val="595959"/>
                                   <w:sz w:val="20"/>
                                 </w:rPr>
-                                <w:t>,Law</w:t>
+                                <w:t>SiliconTower,Law</w:t>
                               </w:r>
                               <w:proofErr w:type="gramEnd"/>
                               <w:r>
@@ -1411,7 +1446,7 @@
                                   <w:sz w:val="20"/>
                                 </w:rPr>
                               </w:pPr>
-                              <w:hyperlink r:id="rId11">
+                              <w:hyperlink r:id="rId9">
                                 <w:r>
                                   <w:rPr>
                                     <w:rFonts w:ascii="Lucida Sans Unicode"/>
@@ -1436,40 +1471,34 @@
               </wp:anchor>
             </w:drawing>
           </mc:Choice>
-          <mc:Fallback xmlns:pic="http://schemas.openxmlformats.org/drawingml/2006/picture" xmlns:a="http://schemas.openxmlformats.org/drawingml/2006/main" xmlns:ve="http://schemas.openxmlformats.org/markup-compatibility/2006">
+          <mc:Fallback>
             <w:pict>
-              <v:group style="position:absolute;margin-left:.000001pt;margin-top:723.034851pt;width:595.5pt;height:119.25pt;mso-position-horizontal-relative:page;mso-position-vertical-relative:page;z-index:15731200" id="docshapegroup4" coordorigin="0,14461" coordsize="11910,2385">
-                <v:shape style="position:absolute;left:0;top:14613;width:11910;height:2232" id="docshape5" coordorigin="0,14614" coordsize="11910,2232" path="m11910,15958l11775,15785,915,15785,0,14614,0,15988,995,15988,1666,16845,11910,16845,11910,15958xe" filled="true" fillcolor="#de7320" stroked="false">
+              <v:group w14:anchorId="1D2D5898" id="Group 7" o:spid="_x0000_s1030" style="position:absolute;margin-left:0;margin-top:723.05pt;width:595.5pt;height:119.25pt;z-index:15731200;mso-wrap-distance-left:0;mso-wrap-distance-right:0;mso-position-horizontal-relative:page;mso-position-vertical-relative:page" coordsize="75628,15144" o:gfxdata="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">
+                <v:shape id="Graphic 8" o:spid="_x0000_s1031" style="position:absolute;top:973;width:75628;height:14173;visibility:visible;mso-wrap-style:square;v-text-anchor:top" coordsize="7562850,1417320" o:gfxdata="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" path="m7562850,853427l7476960,743534r-6895974,l,,,872236r632129,l1057605,1416710r6505245,l7562850,853427xe" fillcolor="#de7320" stroked="f">
                   <v:path arrowok="t"/>
-                  <v:fill type="solid"/>
                 </v:shape>
-                <v:shape style="position:absolute;left:837;top:15217;width:11073;height:1290" id="docshape6" coordorigin="837,15217" coordsize="11073,1290" path="m11910,16507l1845,16507,837,15217,11910,15217,11910,16507xe" filled="true" fillcolor="#ffffff" stroked="false">
+                <v:shape id="Graphic 9" o:spid="_x0000_s1032" style="position:absolute;left:5315;top:4802;width:70314;height:8192;visibility:visible;mso-wrap-style:square;v-text-anchor:top" coordsize="7031355,819150" o:gfxdata="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" path="m7031266,818955r-6391319,l,,7031266,r,818955xe" stroked="f">
                   <v:path arrowok="t"/>
-                  <v:fill type="solid"/>
                 </v:shape>
-                <v:shape style="position:absolute;left:0;top:16310;width:1359;height:535" id="docshape7" coordorigin="0,16310" coordsize="1359,535" path="m1359,16845l0,16845,0,16310,940,16310,1359,16845xe" filled="true" fillcolor="#de7320" stroked="false">
+                <v:shape id="Graphic 10" o:spid="_x0000_s1033" style="position:absolute;top:11743;width:8629;height:3397;visibility:visible;mso-wrap-style:square;v-text-anchor:top" coordsize="862965,339725" o:gfxdata="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" path="m862652,339686l,339686,,,597214,,862652,339686xe" fillcolor="#de7320" stroked="f">
                   <v:path arrowok="t"/>
-                  <v:fill type="solid"/>
                 </v:shape>
-                <v:shape style="position:absolute;left:0;top:15474;width:2087;height:890" id="docshape8" coordorigin="0,15474" coordsize="2087,890" path="m2087,16363l0,16363,0,15474,1393,15474,2087,16362,2087,16363xe" filled="true" fillcolor="#13171b" stroked="false">
+                <v:shape id="Graphic 11" o:spid="_x0000_s1034" style="position:absolute;top:6434;width:13252;height:5652;visibility:visible;mso-wrap-style:square;v-text-anchor:top" coordsize="1325245,565150" o:gfxdata="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" path="m1325212,564589l,564589,,,884518,r440694,563966l1325212,564589xe" fillcolor="#13171b" stroked="f">
                   <v:path arrowok="t"/>
-                  <v:fill type="solid"/>
                 </v:shape>
-                <v:shape style="position:absolute;left:7801;top:15743;width:375;height:241" type="#_x0000_t75" id="docshape9" stroked="false">
-                  <v:imagedata r:id="rId12" o:title=""/>
+                <v:shape id="Image 12" o:spid="_x0000_s1035" type="#_x0000_t75" style="position:absolute;left:49538;top:8146;width:2380;height:1524;visibility:visible;mso-wrap-style:square" o:gfxdata="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">
+                  <v:imagedata r:id="rId10" o:title=""/>
                 </v:shape>
-                <v:shape style="position:absolute;left:2192;top:15781;width:271;height:416" id="docshape10" coordorigin="2193,15781" coordsize="271,416" path="m2328,16196l2307,16164,2260,16087,2214,15995,2193,15920,2203,15866,2232,15822,2275,15792,2328,15781,2380,15792,2423,15822,2435,15840,2328,15840,2300,15845,2278,15861,2262,15884,2257,15912,2262,15941,2278,15964,2300,15980,2328,15985,2445,15985,2442,15995,2395,16087,2349,16164,2328,16196xm2445,15985l2328,15985,2355,15980,2378,15964,2393,15941,2399,15912,2393,15884,2378,15861,2355,15845,2328,15840,2435,15840,2452,15866,2463,15920,2445,15985xe" filled="true" fillcolor="#000000" stroked="false">
+                <v:shape id="Graphic 13" o:spid="_x0000_s1036" style="position:absolute;left:13923;top:8386;width:1721;height:2641;visibility:visible;mso-wrap-style:square;v-text-anchor:top" coordsize="172085,264160" o:gfxdata="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" path="m85807,263581l72400,242950,42903,193924,13407,135801,,87879,6744,53672,25135,25739,52410,6905,85807,r33397,6905l146480,25739r7420,11270l85807,37009,68228,40642,53872,50550,44194,65243,40645,83232r3549,18010l53872,115941r14356,9906l85807,129478r74170,l158208,135801r-29497,58123l99215,242950,85807,263581xem159977,129478r-74170,l103384,125847r14349,-9906l127405,101242r3546,-18010l127405,65243,117733,50550,103384,40642,85807,37009r68093,l164871,53672r6744,34207l159977,129478xe" fillcolor="black" stroked="f">
                   <v:path arrowok="t"/>
-                  <v:fill type="solid"/>
                 </v:shape>
-                <v:shape style="position:absolute;left:1420;top:14460;width:1509;height:658" type="#_x0000_t202" id="docshape11" filled="false" stroked="false">
+                <v:shape id="Textbox 14" o:spid="_x0000_s1037" type="#_x0000_t202" style="position:absolute;left:9018;width:9582;height:4178;visibility:visible;mso-wrap-style:square;v-text-anchor:top" o:gfxdata="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" filled="f" stroked="f">
                   <v:textbox inset="0,0,0,0">
                     <w:txbxContent>
                       <w:p>
                         <w:pPr>
-                          <w:spacing w:line="235" w:lineRule="auto" w:before="0"/>
+                          <w:spacing w:line="235" w:lineRule="auto"/>
                           <w:ind w:left="45" w:right="18" w:hanging="46"/>
-                          <w:jc w:val="left"/>
                           <w:rPr>
                             <w:rFonts w:ascii="Arial Black"/>
                             <w:sz w:val="24"/>
@@ -1491,7 +1520,7 @@
                             <w:w w:val="90"/>
                             <w:sz w:val="24"/>
                           </w:rPr>
-                          <w:t> </w:t>
+                          <w:t xml:space="preserve"> </w:t>
                         </w:r>
                         <w:r>
                           <w:rPr>
@@ -1509,7 +1538,7 @@
                             <w:w w:val="90"/>
                             <w:sz w:val="24"/>
                           </w:rPr>
-                          <w:t> </w:t>
+                          <w:t xml:space="preserve"> </w:t>
                         </w:r>
                         <w:r>
                           <w:rPr>
@@ -1518,7 +1547,7 @@
                             <w:w w:val="90"/>
                             <w:sz w:val="24"/>
                           </w:rPr>
-                          <w:t>Patel </w:t>
+                          <w:t xml:space="preserve">Patel </w:t>
                         </w:r>
                         <w:r>
                           <w:rPr>
@@ -1540,16 +1569,14 @@
                       </w:p>
                     </w:txbxContent>
                   </v:textbox>
-                  <w10:wrap type="none"/>
                 </v:shape>
-                <v:shape style="position:absolute;left:2649;top:15754;width:4537;height:573" type="#_x0000_t202" id="docshape12" filled="false" stroked="false">
+                <v:shape id="Textbox 15" o:spid="_x0000_s1038" type="#_x0000_t202" style="position:absolute;left:16825;top:8217;width:28810;height:3638;visibility:visible;mso-wrap-style:square;v-text-anchor:top" o:gfxdata="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" filled="f" stroked="f">
                   <v:textbox inset="0,0,0,0">
                     <w:txbxContent>
                       <w:p>
                         <w:pPr>
-                          <w:spacing w:line="223" w:lineRule="auto" w:before="1"/>
-                          <w:ind w:left="0" w:right="18" w:firstLine="0"/>
-                          <w:jc w:val="left"/>
+                          <w:spacing w:before="1" w:line="223" w:lineRule="auto"/>
+                          <w:ind w:right="18"/>
                           <w:rPr>
                             <w:rFonts w:ascii="Lucida Sans Unicode"/>
                             <w:sz w:val="20"/>
@@ -1561,7 +1588,44 @@
                             <w:color w:val="595959"/>
                             <w:sz w:val="20"/>
                           </w:rPr>
-                          <w:t>801-SiliconTower,Law</w:t>
+                          <w:t>801-</w:t>
+                        </w:r>
+                        <w:proofErr w:type="gramStart"/>
+                        <w:r>
+                          <w:rPr>
+                            <w:rFonts w:ascii="Lucida Sans Unicode"/>
+                            <w:color w:val="595959"/>
+                            <w:sz w:val="20"/>
+                          </w:rPr>
+                          <w:t>SiliconTower,Law</w:t>
+                        </w:r>
+                        <w:proofErr w:type="gramEnd"/>
+                        <w:r>
+                          <w:rPr>
+                            <w:rFonts w:ascii="Lucida Sans Unicode"/>
+                            <w:color w:val="595959"/>
+                            <w:spacing w:val="-6"/>
+                            <w:sz w:val="20"/>
+                          </w:rPr>
+                          <w:t xml:space="preserve"> </w:t>
+                        </w:r>
+                        <w:proofErr w:type="spellStart"/>
+                        <w:r>
+                          <w:rPr>
+                            <w:rFonts w:ascii="Lucida Sans Unicode"/>
+                            <w:color w:val="595959"/>
+                            <w:sz w:val="20"/>
+                          </w:rPr>
+                          <w:t>Garden,opp</w:t>
+                        </w:r>
+                        <w:proofErr w:type="spellEnd"/>
+                        <w:r>
+                          <w:rPr>
+                            <w:rFonts w:ascii="Lucida Sans Unicode"/>
+                            <w:color w:val="595959"/>
+                            <w:sz w:val="20"/>
+                          </w:rPr>
+                          <w:t>.</w:t>
                         </w:r>
                         <w:r>
                           <w:rPr>
@@ -1570,24 +1634,7 @@
                             <w:spacing w:val="-6"/>
                             <w:sz w:val="20"/>
                           </w:rPr>
-                          <w:t> </w:t>
-                        </w:r>
-                        <w:r>
-                          <w:rPr>
-                            <w:rFonts w:ascii="Lucida Sans Unicode"/>
-                            <w:color w:val="595959"/>
-                            <w:sz w:val="20"/>
-                          </w:rPr>
-                          <w:t>Garden,opp.</w:t>
-                        </w:r>
-                        <w:r>
-                          <w:rPr>
-                            <w:rFonts w:ascii="Lucida Sans Unicode"/>
-                            <w:color w:val="595959"/>
-                            <w:spacing w:val="-6"/>
-                            <w:sz w:val="20"/>
-                          </w:rPr>
-                          <w:t> </w:t>
+                          <w:t xml:space="preserve"> </w:t>
                         </w:r>
                         <w:r>
                           <w:rPr>
@@ -1604,7 +1651,7 @@
                             <w:spacing w:val="-6"/>
                             <w:sz w:val="20"/>
                           </w:rPr>
-                          <w:t> </w:t>
+                          <w:t xml:space="preserve"> </w:t>
                         </w:r>
                         <w:r>
                           <w:rPr>
@@ -1617,22 +1664,19 @@
                       </w:p>
                     </w:txbxContent>
                   </v:textbox>
-                  <w10:wrap type="none"/>
                 </v:shape>
-                <v:shape style="position:absolute;left:8280;top:15717;width:2347;height:288" type="#_x0000_t202" id="docshape13" filled="false" stroked="false">
+                <v:shape id="Textbox 16" o:spid="_x0000_s1039" type="#_x0000_t202" style="position:absolute;left:52579;top:7980;width:14903;height:1828;visibility:visible;mso-wrap-style:square;v-text-anchor:top" o:gfxdata="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" filled="f" stroked="f">
                   <v:textbox inset="0,0,0,0">
                     <w:txbxContent>
                       <w:p>
                         <w:pPr>
-                          <w:spacing w:line="288" w:lineRule="exact" w:before="0"/>
-                          <w:ind w:left="0" w:right="0" w:firstLine="0"/>
-                          <w:jc w:val="left"/>
+                          <w:spacing w:line="288" w:lineRule="exact"/>
                           <w:rPr>
                             <w:rFonts w:ascii="Lucida Sans Unicode"/>
                             <w:sz w:val="20"/>
                           </w:rPr>
                         </w:pPr>
-                        <w:hyperlink r:id="rId13">
+                        <w:hyperlink r:id="rId11">
                           <w:r>
                             <w:rPr>
                               <w:rFonts w:ascii="Lucida Sans Unicode"/>
@@ -1647,9 +1691,8 @@
                       </w:p>
                     </w:txbxContent>
                   </v:textbox>
-                  <w10:wrap type="none"/>
                 </v:shape>
-                <w10:wrap type="none"/>
+                <w10:wrap anchorx="page" anchory="page"/>
               </v:group>
             </w:pict>
           </mc:Fallback>
@@ -1663,9 +1706,9 @@
           <w:lang w:val="en-IN" w:eastAsia="en-IN"/>
         </w:rPr>
         <mc:AlternateContent>
-          <mc:Choice Requires="wps">
+          <mc:Choice Requires="wpg">
             <w:drawing>
-              <wp:anchor distT="0" distB="0" distL="0" distR="0" simplePos="0" relativeHeight="15731712" behindDoc="0" locked="0" layoutInCell="1" allowOverlap="1">
+              <wp:anchor distT="0" distB="0" distL="0" distR="0" simplePos="0" relativeHeight="15731712" behindDoc="0" locked="0" layoutInCell="1" allowOverlap="1" wp14:anchorId="1D2D589A" wp14:editId="1D2D589B">
                 <wp:simplePos x="0" y="0"/>
                 <wp:positionH relativeFrom="page">
                   <wp:posOffset>2413817</wp:posOffset>
@@ -1795,18 +1838,16 @@
               </wp:anchor>
             </w:drawing>
           </mc:Choice>
-          <mc:Fallback xmlns:pic="http://schemas.openxmlformats.org/drawingml/2006/picture" xmlns:a="http://schemas.openxmlformats.org/drawingml/2006/main" xmlns:ve="http://schemas.openxmlformats.org/markup-compatibility/2006">
+          <mc:Fallback>
             <w:pict>
-              <v:group style="position:absolute;margin-left:190.064377pt;margin-top:-.000068pt;width:405.45pt;height:39.2pt;mso-position-horizontal-relative:page;mso-position-vertical-relative:page;z-index:15731712" id="docshapegroup14" coordorigin="3801,0" coordsize="8109,784">
-                <v:shape style="position:absolute;left:3801;top:0;width:6983;height:317" id="docshape15" coordorigin="3801,0" coordsize="6983,317" path="m10784,317l4049,317,3801,0,10538,0,10784,315,10784,317xe" filled="true" fillcolor="#13171b" stroked="false">
+              <v:group w14:anchorId="529188FA" id="Group 17" o:spid="_x0000_s1026" style="position:absolute;margin-left:190.05pt;margin-top:0;width:405.45pt;height:39.2pt;z-index:15731712;mso-wrap-distance-left:0;mso-wrap-distance-right:0;mso-position-horizontal-relative:page;mso-position-vertical-relative:page" coordsize="51492,4978" o:gfxdata="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">
+                <v:shape id="Graphic 18" o:spid="_x0000_s1027" style="position:absolute;width:44342;height:2012;visibility:visible;mso-wrap-style:square;v-text-anchor:top" coordsize="4434205,201295" o:gfxdata="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" path="m4434201,201021r-4277120,l,,4277932,r156269,199980l4434201,201021xe" fillcolor="#13171b" stroked="f">
                   <v:path arrowok="t"/>
-                  <v:fill type="solid"/>
                 </v:shape>
-                <v:shape style="position:absolute;left:7318;top:0;width:4592;height:784" id="docshape16" coordorigin="7319,0" coordsize="4592,784" path="m11910,784l7931,784,7319,0,11910,0,11910,784xe" filled="true" fillcolor="#de7320" stroked="false">
+                <v:shape id="Graphic 19" o:spid="_x0000_s1028" style="position:absolute;left:22337;width:29159;height:4978;visibility:visible;mso-wrap-style:square;v-text-anchor:top" coordsize="2915920,497840" o:gfxdata="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" path="m2915320,497658r-2526441,l,,2915320,r,497658xe" fillcolor="#de7320" stroked="f">
                   <v:path arrowok="t"/>
-                  <v:fill type="solid"/>
                 </v:shape>
-                <w10:wrap type="none"/>
+                <w10:wrap anchorx="page" anchory="page"/>
               </v:group>
             </w:pict>
           </mc:Fallback>
@@ -2529,13 +2570,7 @@
         <w:rPr>
           <w:w w:val="110"/>
         </w:rPr>
-        <w:t>the training period, they will receive practical guidance from our mentors and work on assignments and project development activities. They will spend 14 hours per week, including learning, assignments, and project work, to gain h</w:t>
-      </w:r>
-      <w:r>
-        <w:rPr>
-          <w:w w:val="110"/>
-        </w:rPr>
-        <w:t>ands-on experience and enhance their technical skills.</w:t>
+        <w:t>the training period, they will receive practical guidance from our mentors and work on assignments and project development activities. They will spend 14 hours per week, including learning, assignments, and project work, to gain hands-on experience and enhance their technical skills.</w:t>
       </w:r>
     </w:p>
     <w:p>
@@ -2559,7 +2594,7 @@
         <mc:AlternateContent>
           <mc:Choice Requires="wps">
             <w:drawing>
-              <wp:anchor distT="0" distB="0" distL="0" distR="0" simplePos="0" relativeHeight="487517696" behindDoc="1" locked="0" layoutInCell="1" allowOverlap="1">
+              <wp:anchor distT="0" distB="0" distL="0" distR="0" simplePos="0" relativeHeight="487517696" behindDoc="1" locked="0" layoutInCell="1" allowOverlap="1" wp14:anchorId="1D2D589C" wp14:editId="1D2D589D">
                 <wp:simplePos x="0" y="0"/>
                 <wp:positionH relativeFrom="page">
                   <wp:posOffset>988162</wp:posOffset>
@@ -2624,12 +2659,16 @@
                               <w:jc w:val="center"/>
                               <w:rPr>
                                 <w:rFonts w:ascii="Lucida Sans Unicode"/>
+                                <w:b/>
+                                <w:bCs/>
                                 <w:sz w:val="20"/>
                               </w:rPr>
                             </w:pPr>
                             <w:r>
                               <w:rPr>
                                 <w:rFonts w:ascii="Lucida Sans Unicode"/>
+                                <w:b/>
+                                <w:bCs/>
                                 <w:spacing w:val="-10"/>
                                 <w:w w:val="60"/>
                                 <w:sz w:val="20"/>
@@ -2703,15 +2742,14 @@
               </wp:anchor>
             </w:drawing>
           </mc:Choice>
-          <mc:Fallback xmlns:pic="http://schemas.openxmlformats.org/drawingml/2006/picture" xmlns:a="http://schemas.openxmlformats.org/drawingml/2006/main" xmlns:ve="http://schemas.openxmlformats.org/markup-compatibility/2006">
+          <mc:Fallback>
             <w:pict>
-              <v:shape style="position:absolute;margin-left:77.808105pt;margin-top:68.796906pt;width:14.3pt;height:133.7pt;mso-position-horizontal-relative:page;mso-position-vertical-relative:paragraph;z-index:-15798784" type="#_x0000_t202" id="docshape17" filled="false" stroked="false">
+              <v:shape w14:anchorId="1D2D589C" id="Textbox 20" o:spid="_x0000_s1040" type="#_x0000_t202" style="position:absolute;left:0;text-align:left;margin-left:77.8pt;margin-top:68.8pt;width:14.3pt;height:133.7pt;z-index:-15798784;visibility:visible;mso-wrap-style:square;mso-wrap-distance-left:0;mso-wrap-distance-top:0;mso-wrap-distance-right:0;mso-wrap-distance-bottom:0;mso-position-horizontal:absolute;mso-position-horizontal-relative:page;mso-position-vertical:absolute;mso-position-vertical-relative:text;v-text-anchor:top" o:gfxdata="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" filled="f" stroked="f">
                 <v:textbox inset="0,0,0,0">
                   <w:txbxContent>
                     <w:p>
                       <w:pPr>
-                        <w:spacing w:line="278" w:lineRule="exact" w:before="0"/>
-                        <w:ind w:left="0" w:right="0" w:firstLine="0"/>
+                        <w:spacing w:line="278" w:lineRule="exact"/>
                         <w:jc w:val="center"/>
                         <w:rPr>
                           <w:rFonts w:ascii="Arial Black"/>
@@ -2739,17 +2777,19 @@
                     </w:p>
                     <w:p>
                       <w:pPr>
-                        <w:spacing w:before="0"/>
-                        <w:ind w:left="0" w:right="0" w:firstLine="0"/>
                         <w:jc w:val="center"/>
                         <w:rPr>
                           <w:rFonts w:ascii="Lucida Sans Unicode"/>
+                          <w:b/>
+                          <w:bCs/>
                           <w:sz w:val="20"/>
                         </w:rPr>
                       </w:pPr>
                       <w:r>
                         <w:rPr>
                           <w:rFonts w:ascii="Lucida Sans Unicode"/>
+                          <w:b/>
+                          <w:bCs/>
                           <w:spacing w:val="-10"/>
                           <w:w w:val="60"/>
                           <w:sz w:val="20"/>
@@ -2769,8 +2809,6 @@
                     </w:p>
                     <w:p>
                       <w:pPr>
-                        <w:spacing w:before="0"/>
-                        <w:ind w:left="0" w:right="0" w:firstLine="0"/>
                         <w:jc w:val="center"/>
                         <w:rPr>
                           <w:rFonts w:ascii="Lucida Sans Unicode"/>
@@ -2798,8 +2836,7 @@
                     </w:p>
                     <w:p>
                       <w:pPr>
-                        <w:spacing w:line="291" w:lineRule="exact" w:before="0"/>
-                        <w:ind w:left="0" w:right="0" w:firstLine="0"/>
+                        <w:spacing w:line="291" w:lineRule="exact"/>
                         <w:jc w:val="center"/>
                         <w:rPr>
                           <w:rFonts w:ascii="Lucida Sans Unicode"/>
@@ -2817,7 +2854,7 @@
                     </w:p>
                   </w:txbxContent>
                 </v:textbox>
-                <w10:wrap type="none"/>
+                <w10:wrap anchorx="page"/>
               </v:shape>
             </w:pict>
           </mc:Fallback>
@@ -2831,7 +2868,7 @@
         <mc:AlternateContent>
           <mc:Choice Requires="wps">
             <w:drawing>
-              <wp:anchor distT="0" distB="0" distL="0" distR="0" simplePos="0" relativeHeight="487518208" behindDoc="1" locked="0" layoutInCell="1" allowOverlap="1">
+              <wp:anchor distT="0" distB="0" distL="0" distR="0" simplePos="0" relativeHeight="487518208" behindDoc="1" locked="0" layoutInCell="1" allowOverlap="1" wp14:anchorId="1D2D589E" wp14:editId="1D2D589F">
                 <wp:simplePos x="0" y="0"/>
                 <wp:positionH relativeFrom="page">
                   <wp:posOffset>1530215</wp:posOffset>
@@ -2938,21 +2975,7 @@
                               <w:rPr>
                                 <w:sz w:val="24"/>
                               </w:rPr>
-                              <w:t xml:space="preserve"> </w:t>
-                            </w:r>
-                            <w:proofErr w:type="spellStart"/>
-                            <w:r>
-                              <w:rPr>
-                                <w:sz w:val="24"/>
-                              </w:rPr>
-                              <w:t>Parmar</w:t>
-                            </w:r>
-                            <w:proofErr w:type="spellEnd"/>
-                            <w:r>
-                              <w:rPr>
-                                <w:sz w:val="24"/>
-                              </w:rPr>
-                              <w:t xml:space="preserve"> </w:t>
+                              <w:t xml:space="preserve"> Parmar </w:t>
                             </w:r>
                             <w:proofErr w:type="spellStart"/>
                             <w:r>
@@ -2980,21 +3003,7 @@
                               <w:rPr>
                                 <w:sz w:val="24"/>
                               </w:rPr>
-                              <w:t xml:space="preserve">Shah </w:t>
-                            </w:r>
-                            <w:proofErr w:type="spellStart"/>
-                            <w:r>
-                              <w:rPr>
-                                <w:sz w:val="24"/>
-                              </w:rPr>
-                              <w:t>Hetansh</w:t>
-                            </w:r>
-                            <w:proofErr w:type="spellEnd"/>
-                            <w:r>
-                              <w:rPr>
-                                <w:sz w:val="24"/>
-                              </w:rPr>
-                              <w:t xml:space="preserve"> </w:t>
+                              <w:t xml:space="preserve">Shah Hetansh </w:t>
                             </w:r>
                             <w:proofErr w:type="spellStart"/>
                             <w:r>
@@ -3017,15 +3026,15 @@
               </wp:anchor>
             </w:drawing>
           </mc:Choice>
-          <mc:Fallback xmlns:pic="http://schemas.openxmlformats.org/drawingml/2006/picture" xmlns:a="http://schemas.openxmlformats.org/drawingml/2006/main" xmlns:ve="http://schemas.openxmlformats.org/markup-compatibility/2006">
+          <mc:Fallback>
             <w:pict>
-              <v:shape style="position:absolute;margin-left:120.489426pt;margin-top:68.796906pt;width:171.8pt;height:132.65pt;mso-position-horizontal-relative:page;mso-position-vertical-relative:paragraph;z-index:-15798272" type="#_x0000_t202" id="docshape18" filled="false" stroked="false">
+              <v:shape w14:anchorId="1D2D589E" id="Textbox 21" o:spid="_x0000_s1041" type="#_x0000_t202" style="position:absolute;left:0;text-align:left;margin-left:120.5pt;margin-top:68.8pt;width:171.8pt;height:132.65pt;z-index:-15798272;visibility:visible;mso-wrap-style:square;mso-wrap-distance-left:0;mso-wrap-distance-top:0;mso-wrap-distance-right:0;mso-wrap-distance-bottom:0;mso-position-horizontal:absolute;mso-position-horizontal-relative:page;mso-position-vertical:absolute;mso-position-vertical-relative:text;v-text-anchor:top" o:gfxdata="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" filled="f" stroked="f">
                 <v:textbox inset="0,0,0,0">
                   <w:txbxContent>
                     <w:p>
                       <w:pPr>
-                        <w:spacing w:line="681" w:lineRule="auto" w:before="0"/>
-                        <w:ind w:left="0" w:right="0" w:firstLine="1918"/>
+                        <w:spacing w:line="681" w:lineRule="auto"/>
+                        <w:ind w:firstLine="1918"/>
                         <w:jc w:val="both"/>
                         <w:rPr>
                           <w:sz w:val="24"/>
@@ -3045,7 +3054,7 @@
                           <w:spacing w:val="-13"/>
                           <w:sz w:val="20"/>
                         </w:rPr>
-                        <w:t> </w:t>
+                        <w:t xml:space="preserve"> </w:t>
                       </w:r>
                       <w:r>
                         <w:rPr>
@@ -3053,46 +3062,70 @@
                           <w:spacing w:val="-4"/>
                           <w:sz w:val="20"/>
                         </w:rPr>
-                        <w:t>Name </w:t>
+                        <w:t xml:space="preserve">Name </w:t>
                       </w:r>
+                      <w:proofErr w:type="spellStart"/>
                       <w:r>
                         <w:rPr>
                           <w:sz w:val="24"/>
                         </w:rPr>
                         <w:t>Khambhadiya</w:t>
                       </w:r>
+                      <w:proofErr w:type="spellEnd"/>
                       <w:r>
                         <w:rPr>
                           <w:spacing w:val="-4"/>
                           <w:sz w:val="24"/>
                         </w:rPr>
-                        <w:t> </w:t>
+                        <w:t xml:space="preserve"> </w:t>
                       </w:r>
+                      <w:proofErr w:type="spellStart"/>
                       <w:r>
                         <w:rPr>
                           <w:sz w:val="24"/>
                         </w:rPr>
                         <w:t>Taksh</w:t>
                       </w:r>
+                      <w:proofErr w:type="spellEnd"/>
                       <w:r>
                         <w:rPr>
                           <w:spacing w:val="-4"/>
                           <w:sz w:val="24"/>
                         </w:rPr>
-                        <w:t> </w:t>
+                        <w:t xml:space="preserve"> </w:t>
                       </w:r>
+                      <w:proofErr w:type="spellStart"/>
                       <w:r>
                         <w:rPr>
                           <w:sz w:val="24"/>
                         </w:rPr>
-                        <w:t>Khodabhai Parmar Kishan S.</w:t>
+                        <w:t>Khodabhai</w:t>
+                      </w:r>
+                      <w:proofErr w:type="spellEnd"/>
+                      <w:r>
+                        <w:rPr>
+                          <w:sz w:val="24"/>
+                        </w:rPr>
+                        <w:t xml:space="preserve"> Parmar </w:t>
+                      </w:r>
+                      <w:proofErr w:type="spellStart"/>
+                      <w:r>
+                        <w:rPr>
+                          <w:sz w:val="24"/>
+                        </w:rPr>
+                        <w:t>Kishan</w:t>
+                      </w:r>
+                      <w:proofErr w:type="spellEnd"/>
+                      <w:r>
+                        <w:rPr>
+                          <w:sz w:val="24"/>
+                        </w:rPr>
+                        <w:t xml:space="preserve"> S.</w:t>
                       </w:r>
                     </w:p>
                     <w:p>
                       <w:pPr>
                         <w:spacing w:before="8"/>
-                        <w:ind w:left="0" w:right="0" w:firstLine="0"/>
-                        <w:jc w:val="left"/>
                         <w:rPr>
                           <w:sz w:val="24"/>
                         </w:rPr>
@@ -3101,8 +3134,9 @@
                         <w:rPr>
                           <w:sz w:val="24"/>
                         </w:rPr>
-                        <w:t>Shah Hetansh </w:t>
+                        <w:t xml:space="preserve">Shah Hetansh </w:t>
                       </w:r>
+                      <w:proofErr w:type="spellStart"/>
                       <w:r>
                         <w:rPr>
                           <w:spacing w:val="-2"/>
@@ -3110,10 +3144,11 @@
                         </w:rPr>
                         <w:t>Bipinbhai</w:t>
                       </w:r>
+                      <w:proofErr w:type="spellEnd"/>
                     </w:p>
                   </w:txbxContent>
                 </v:textbox>
-                <w10:wrap type="none"/>
+                <w10:wrap anchorx="page"/>
               </v:shape>
             </w:pict>
           </mc:Fallback>
@@ -3127,7 +3162,7 @@
         <mc:AlternateContent>
           <mc:Choice Requires="wps">
             <w:drawing>
-              <wp:anchor distT="0" distB="0" distL="0" distR="0" simplePos="0" relativeHeight="487518720" behindDoc="1" locked="0" layoutInCell="1" allowOverlap="1">
+              <wp:anchor distT="0" distB="0" distL="0" distR="0" simplePos="0" relativeHeight="487518720" behindDoc="1" locked="0" layoutInCell="1" allowOverlap="1" wp14:anchorId="1D2D58A0" wp14:editId="1D2D58A1">
                 <wp:simplePos x="0" y="0"/>
                 <wp:positionH relativeFrom="page">
                   <wp:posOffset>5239313</wp:posOffset>
@@ -3271,16 +3306,14 @@
               </wp:anchor>
             </w:drawing>
           </mc:Choice>
-          <mc:Fallback xmlns:pic="http://schemas.openxmlformats.org/drawingml/2006/picture" xmlns:a="http://schemas.openxmlformats.org/drawingml/2006/main" xmlns:ve="http://schemas.openxmlformats.org/markup-compatibility/2006">
+          <mc:Fallback>
             <w:pict>
-              <v:shape style="position:absolute;margin-left:412.544403pt;margin-top:68.714470pt;width:111.4pt;height:132.75pt;mso-position-horizontal-relative:page;mso-position-vertical-relative:paragraph;z-index:-15797760" type="#_x0000_t202" id="docshape19" filled="false" stroked="false">
+              <v:shape w14:anchorId="1D2D58A0" id="Textbox 22" o:spid="_x0000_s1042" type="#_x0000_t202" style="position:absolute;left:0;text-align:left;margin-left:412.55pt;margin-top:68.7pt;width:111.4pt;height:132.75pt;z-index:-15797760;visibility:visible;mso-wrap-style:square;mso-wrap-distance-left:0;mso-wrap-distance-top:0;mso-wrap-distance-right:0;mso-wrap-distance-bottom:0;mso-position-horizontal:absolute;mso-position-horizontal-relative:page;mso-position-vertical:absolute;mso-position-vertical-relative:text;v-text-anchor:top" o:gfxdata="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" filled="f" stroked="f">
                 <v:textbox inset="0,0,0,0">
                   <w:txbxContent>
                     <w:p>
                       <w:pPr>
-                        <w:spacing w:line="268" w:lineRule="exact" w:before="0"/>
-                        <w:ind w:left="0" w:right="0" w:firstLine="0"/>
-                        <w:jc w:val="left"/>
+                        <w:spacing w:line="268" w:lineRule="exact"/>
                         <w:rPr>
                           <w:rFonts w:ascii="Arial"/>
                           <w:b/>
@@ -3293,7 +3326,7 @@
                           <w:b/>
                           <w:sz w:val="24"/>
                         </w:rPr>
-                        <w:t>Enrollment </w:t>
+                        <w:t xml:space="preserve">Enrollment </w:t>
                       </w:r>
                       <w:r>
                         <w:rPr>
@@ -3318,9 +3351,7 @@
                     </w:p>
                     <w:p>
                       <w:pPr>
-                        <w:spacing w:before="0"/>
-                        <w:ind w:left="312" w:right="0" w:firstLine="0"/>
-                        <w:jc w:val="left"/>
+                        <w:ind w:left="312"/>
                         <w:rPr>
                           <w:sz w:val="24"/>
                         </w:rPr>
@@ -3344,9 +3375,7 @@
                     </w:p>
                     <w:p>
                       <w:pPr>
-                        <w:spacing w:before="0"/>
-                        <w:ind w:left="312" w:right="0" w:firstLine="0"/>
-                        <w:jc w:val="left"/>
+                        <w:ind w:left="312"/>
                         <w:rPr>
                           <w:sz w:val="24"/>
                         </w:rPr>
@@ -3370,9 +3399,7 @@
                     </w:p>
                     <w:p>
                       <w:pPr>
-                        <w:spacing w:before="0"/>
-                        <w:ind w:left="312" w:right="0" w:firstLine="0"/>
-                        <w:jc w:val="left"/>
+                        <w:ind w:left="312"/>
                         <w:rPr>
                           <w:sz w:val="24"/>
                         </w:rPr>
@@ -3387,7 +3414,7 @@
                     </w:p>
                   </w:txbxContent>
                 </v:textbox>
-                <w10:wrap type="none"/>
+                <w10:wrap anchorx="page"/>
               </v:shape>
             </w:pict>
           </mc:Fallback>
@@ -3397,13 +3424,7 @@
         <w:rPr>
           <w:w w:val="120"/>
         </w:rPr>
-        <w:t>Upon successful completion of the</w:t>
-      </w:r>
-      <w:r>
-        <w:rPr>
-          <w:w w:val="120"/>
-        </w:rPr>
-        <w:t xml:space="preserve"> Project training, Vibrant </w:t>
+        <w:t xml:space="preserve">Upon successful completion of the Project training, Vibrant </w:t>
       </w:r>
       <w:proofErr w:type="spellStart"/>
       <w:r>
@@ -3505,8 +3526,6 @@
           <w:sz w:val="20"/>
         </w:rPr>
       </w:pPr>
-      <w:bookmarkStart w:id="19" w:name="_GoBack"/>
-      <w:bookmarkEnd w:id="19"/>
       <w:r>
         <w:rPr>
           <w:noProof/>
@@ -3516,16 +3535,16 @@
         <mc:AlternateContent>
           <mc:Choice Requires="wps">
             <w:drawing>
-              <wp:anchor distT="0" distB="0" distL="114300" distR="114300" simplePos="0" relativeHeight="487588352" behindDoc="0" locked="0" layoutInCell="1" allowOverlap="1">
+              <wp:anchor distT="0" distB="0" distL="114300" distR="114300" simplePos="0" relativeHeight="487588352" behindDoc="0" locked="0" layoutInCell="1" allowOverlap="1" wp14:anchorId="1D2D58A2" wp14:editId="21AF6E9A">
                 <wp:simplePos x="0" y="0"/>
                 <wp:positionH relativeFrom="column">
-                  <wp:posOffset>289891</wp:posOffset>
+                  <wp:posOffset>340995</wp:posOffset>
                 </wp:positionH>
                 <wp:positionV relativeFrom="paragraph">
-                  <wp:posOffset>312392</wp:posOffset>
+                  <wp:posOffset>313055</wp:posOffset>
                 </wp:positionV>
-                <wp:extent cx="6107059" cy="2020562"/>
-                <wp:effectExtent l="0" t="0" r="27305" b="18415"/>
+                <wp:extent cx="6172200" cy="2000250"/>
+                <wp:effectExtent l="0" t="0" r="19050" b="19050"/>
                 <wp:wrapTopAndBottom/>
                 <wp:docPr id="25" name="Graphic 25"/>
                 <wp:cNvGraphicFramePr/>
@@ -3536,7 +3555,7 @@
                       <wps:spPr>
                         <a:xfrm>
                           <a:off x="0" y="0"/>
-                          <a:ext cx="6107059" cy="2020562"/>
+                          <a:ext cx="6172200" cy="2000250"/>
                         </a:xfrm>
                         <a:custGeom>
                           <a:avLst/>
@@ -3635,12 +3654,18 @@
                     </wps:wsp>
                   </a:graphicData>
                 </a:graphic>
+                <wp14:sizeRelH relativeFrom="margin">
+                  <wp14:pctWidth>0</wp14:pctWidth>
+                </wp14:sizeRelH>
+                <wp14:sizeRelV relativeFrom="margin">
+                  <wp14:pctHeight>0</wp14:pctHeight>
+                </wp14:sizeRelV>
               </wp:anchor>
             </w:drawing>
           </mc:Choice>
           <mc:Fallback>
             <w:pict>
-              <v:shape id="Graphic 25" o:spid="_x0000_s1026" style="position:absolute;margin-left:22.85pt;margin-top:24.6pt;width:480.85pt;height:159.1pt;z-index:487588352;visibility:visible;mso-wrap-style:square;mso-wrap-distance-left:9pt;mso-wrap-distance-top:0;mso-wrap-distance-right:9pt;mso-wrap-distance-bottom:0;mso-position-horizontal:absolute;mso-position-horizontal-relative:text;mso-position-vertical:absolute;mso-position-vertical-relative:text;v-text-anchor:top" coordsize="6107430,2020570" o:gfxdata="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" path="m9528,9528r,2001004em664435,9528r,2001004em4312341,9528r,2001004em6097395,9528r,2001004em,l6106923,em,505015r6106923,em,1010030r6106923,em,1515045r6106923,em,2020061r6106923,e" filled="f" strokeweight=".52936mm">
+              <v:shape w14:anchorId="70492018" id="Graphic 25" o:spid="_x0000_s1026" style="position:absolute;margin-left:26.85pt;margin-top:24.65pt;width:486pt;height:157.5pt;z-index:487588352;visibility:visible;mso-wrap-style:square;mso-width-percent:0;mso-height-percent:0;mso-wrap-distance-left:9pt;mso-wrap-distance-top:0;mso-wrap-distance-right:9pt;mso-wrap-distance-bottom:0;mso-position-horizontal:absolute;mso-position-horizontal-relative:text;mso-position-vertical:absolute;mso-position-vertical-relative:text;mso-width-percent:0;mso-height-percent:0;mso-width-relative:margin;mso-height-relative:margin;v-text-anchor:top" coordsize="6107430,2020570" o:gfxdata="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" path="m9528,9528r,2001004em664435,9528r,2001004em4312341,9528r,2001004em6097395,9528r,2001004em,l6106923,em,505015r6106923,em,1010030r6106923,em,1515045r6106923,em,2020061r6106923,e" filled="f" strokeweight=".52936mm">
                 <v:path arrowok="t"/>
                 <w10:wrap type="topAndBottom"/>
               </v:shape>
@@ -3660,7 +3685,7 @@
 </file>
 
 <file path=word/styles.xml><?xml version="1.0" encoding="utf-8"?>
-<w:styles xmlns:mc="http://schemas.openxmlformats.org/markup-compatibility/2006" xmlns:r="http://schemas.openxmlformats.org/officeDocument/2006/relationships" xmlns:w="http://schemas.openxmlformats.org/wordprocessingml/2006/main" xmlns:w14="http://schemas.microsoft.com/office/word/2010/wordml" mc:Ignorable="w14">
+<w:styles xmlns:mc="http://schemas.openxmlformats.org/markup-compatibility/2006" xmlns:r="http://schemas.openxmlformats.org/officeDocument/2006/relationships" xmlns:w="http://schemas.openxmlformats.org/wordprocessingml/2006/main" xmlns:w14="http://schemas.microsoft.com/office/word/2010/wordml" xmlns:w15="http://schemas.microsoft.com/office/word/2012/wordml" xmlns:w16cex="http://schemas.microsoft.com/office/word/2018/wordml/cex" xmlns:w16cid="http://schemas.microsoft.com/office/word/2016/wordml/cid" xmlns:w16="http://schemas.microsoft.com/office/word/2018/wordml" xmlns:w16sdtdh="http://schemas.microsoft.com/office/word/2020/wordml/sdtdatahash" xmlns:w16se="http://schemas.microsoft.com/office/word/2015/wordml/symex" mc:Ignorable="w14 w15 w16se w16cid w16 w16cex w16sdtdh">
   <w:docDefaults>
     <w:rPrDefault>
       <w:rPr>
@@ -3678,422 +3703,383 @@
       </w:pPr>
     </w:pPrDefault>
   </w:docDefaults>
-  <w:latentStyles w:defLockedState="0" w:defUIPriority="99" w:defSemiHidden="1" w:defUnhideWhenUsed="1" w:defQFormat="0" w:count="267">
-    <w:lsdException w:name="Normal" w:semiHidden="0" w:uiPriority="0" w:unhideWhenUsed="0" w:qFormat="1"/>
-    <w:lsdException w:name="heading 1" w:semiHidden="0" w:uiPriority="9" w:unhideWhenUsed="0" w:qFormat="1"/>
-    <w:lsdException w:name="heading 2" w:uiPriority="9" w:qFormat="1"/>
-    <w:lsdException w:name="heading 3" w:uiPriority="9" w:qFormat="1"/>
-    <w:lsdException w:name="heading 4" w:uiPriority="9" w:qFormat="1"/>
-    <w:lsdException w:name="heading 5" w:uiPriority="9" w:qFormat="1"/>
-    <w:lsdException w:name="heading 6" w:uiPriority="9" w:qFormat="1"/>
-    <w:lsdException w:name="heading 7" w:uiPriority="9" w:qFormat="1"/>
-    <w:lsdException w:name="heading 8" w:uiPriority="9" w:qFormat="1"/>
-    <w:lsdException w:name="heading 9" w:uiPriority="9" w:qFormat="1"/>
-    <w:lsdException w:name="toc 1" w:uiPriority="39"/>
-    <w:lsdException w:name="toc 2" w:uiPriority="39"/>
-    <w:lsdException w:name="toc 3" w:uiPriority="39"/>
-    <w:lsdException w:name="toc 4" w:uiPriority="39"/>
-    <w:lsdException w:name="toc 5" w:uiPriority="39"/>
-    <w:lsdException w:name="toc 6" w:uiPriority="39"/>
-    <w:lsdException w:name="toc 7" w:uiPriority="39"/>
-    <w:lsdException w:name="toc 8" w:uiPriority="39"/>
-    <w:lsdException w:name="toc 9" w:uiPriority="39"/>
-    <w:lsdException w:name="caption" w:uiPriority="35" w:qFormat="1"/>
-    <w:lsdException w:name="Title" w:semiHidden="0" w:uiPriority="10" w:unhideWhenUsed="0" w:qFormat="1"/>
-    <w:lsdException w:name="Default Paragraph Font" w:uiPriority="1"/>
-    <w:lsdException w:name="Subtitle" w:semiHidden="0" w:uiPriority="11" w:unhideWhenUsed="0" w:qFormat="1"/>
-    <w:lsdException w:name="Strong" w:semiHidden="0" w:uiPriority="22" w:unhideWhenUsed="0" w:qFormat="1"/>
-    <w:lsdException w:name="Emphasis" w:semiHidden="0" w:uiPriority="20" w:unhideWhenUsed="0" w:qFormat="1"/>
-    <w:lsdException w:name="Table Grid" w:semiHidden="0" w:uiPriority="59" w:unhideWhenUsed="0"/>
-    <w:lsdException w:name="Placeholder Text" w:unhideWhenUsed="0"/>
-    <w:lsdException w:name="No Spacing" w:semiHidden="0" w:uiPriority="1" w:unhideWhenUsed="0" w:qFormat="1"/>
-    <w:lsdException w:name="Light Shading" w:semiHidden="0" w:uiPriority="60" w:unhideWhenUsed="0"/>
-    <w:lsdException w:name="Light List" w:semiHidden="0" w:uiPriority="61" w:unhideWhenUsed="0"/>
-    <w:lsdException w:name="Light Grid" w:semiHidden="0" w:uiPriority="62" w:unhideWhenUsed="0"/>
-    <w:lsdException w:name="Medium Shading 1" w:semiHidden="0" w:uiPriority="63" w:unhideWhenUsed="0"/>
-    <w:lsdException w:name="Medium Shading 2" w:semiHidden="0" w:uiPriority="64" w:unhideWhenUsed="0"/>
-    <w:lsdException w:name="Medium List 1" w:semiHidden="0" w:uiPriority="65" w:unhideWhenUsed="0"/>
-    <w:lsdException w:name="Medium List 2" w:semiHidden="0" w:uiPriority="66" w:unhideWhenUsed="0"/>
-    <w:lsdException w:name="Medium Grid 1" w:semiHidden="0" w:uiPriority="67" w:unhideWhenUsed="0"/>
-    <w:lsdException w:name="Medium Grid 2" w:semiHidden="0" w:uiPriority="68" w:unhideWhenUsed="0"/>
-    <w:lsdException w:name="Medium Grid 3" w:semiHidden="0" w:uiPriority="69" w:unhideWhenUsed="0"/>
-    <w:lsdException w:name="Dark List" w:semiHidden="0" w:uiPriority="70" w:unhideWhenUsed="0"/>
-    <w:lsdException w:name="Colorful Shading" w:semiHidden="0" w:uiPriority="71" w:unhideWhenUsed="0"/>
-    <w:lsdException w:name="Colorful List" w:semiHidden="0" w:uiPriority="72" w:unhideWhenUsed="0"/>
-    <w:lsdException w:name="Colorful Grid" w:semiHidden="0" w:uiPriority="73" w:unhideWhenUsed="0"/>
-    <w:lsdException w:name="Light Shading Accent 1" w:semiHidden="0" w:uiPriority="60" w:unhideWhenUsed="0"/>
-    <w:lsdException w:name="Light List Accent 1" w:semiHidden="0" w:uiPriority="61" w:unhideWhenUsed="0"/>
-    <w:lsdException w:name="Light Grid Accent 1" w:semiHidden="0" w:uiPriority="62" w:unhideWhenUsed="0"/>
-    <w:lsdException w:name="Medium Shading 1 Accent 1" w:semiHidden="0" w:uiPriority="63" w:unhideWhenUsed="0"/>
-    <w:lsdException w:name="Medium Shading 2 Accent 1" w:semiHidden="0" w:uiPriority="64" w:unhideWhenUsed="0"/>
-    <w:lsdException w:name="Medium List 1 Accent 1" w:semiHidden="0" w:uiPriority="65" w:unhideWhenUsed="0"/>
-    <w:lsdException w:name="Revision" w:unhideWhenUsed="0"/>
-    <w:lsdException w:name="List Paragraph" w:semiHidden="0" w:uiPriority="34" w:unhideWhenUsed="0" w:qFormat="1"/>
-    <w:lsdException w:name="Quote" w:semiHidden="0" w:uiPriority="29" w:unhideWhenUsed="0" w:qFormat="1"/>
-    <w:lsdException w:name="Intense Quote" w:semiHidden="0" w:uiPriority="30" w:unhideWhenUsed="0" w:qFormat="1"/>
-    <w:lsdException w:name="Medium List 2 Accent 1" w:semiHidden="0" w:uiPriority="66" w:unhideWhenUsed="0"/>
-    <w:lsdException w:name="Medium Grid 1 Accent 1" w:semiHidden="0" w:uiPriority="67" w:unhideWhenUsed="0"/>
-    <w:lsdException w:name="Medium Grid 2 Accent 1" w:semiHidden="0" w:uiPriority="68" w:unhideWhenUsed="0"/>
-    <w:lsdException w:name="Medium Grid 3 Accent 1" w:semiHidden="0" w:uiPriority="69" w:unhideWhenUsed="0"/>
-    <w:lsdException w:name="Dark List Accent 1" w:semiHidden="0" w:uiPriority="70" w:unhideWhenUsed="0"/>
-    <w:lsdException w:name="Colorful Shading Accent 1" w:semiHidden="0" w:uiPriority="71" w:unhideWhenUsed="0"/>
-    <w:lsdException w:name="Colorful List Accent 1" w:semiHidden="0" w:uiPriority="72" w:unhideWhenUsed="0"/>
-    <w:lsdException w:name="Colorful Grid Accent 1" w:semiHidden="0" w:uiPriority="73" w:unhideWhenUsed="0"/>
-    <w:lsdException w:name="Light Shading Accent 2" w:semiHidden="0" w:uiPriority="60" w:unhideWhenUsed="0"/>
-    <w:lsdException w:name="Light List Accent 2" w:semiHidden="0" w:uiPriority="61" w:unhideWhenUsed="0"/>
-    <w:lsdException w:name="Light Grid Accent 2" w:semiHidden="0" w:uiPriority="62" w:unhideWhenUsed="0"/>
-    <w:lsdException w:name="Medium Shading 1 Accent 2" w:semiHidden="0" w:uiPriority="63" w:unhideWhenUsed="0"/>
-    <w:lsdException w:name="Medium Shading 2 Accent 2" w:semiHidden="0" w:uiPriority="64" w:unhideWhenUsed="0"/>
-    <w:lsdException w:name="Medium List 1 Accent 2" w:semiHidden="0" w:uiPriority="65" w:unhideWhenUsed="0"/>
-    <w:lsdException w:name="Medium List 2 Accent 2" w:semiHidden="0" w:uiPriority="66" w:unhideWhenUsed="0"/>
-    <w:lsdException w:name="Medium Grid 1 Accent 2" w:semiHidden="0" w:uiPriority="67" w:unhideWhenUsed="0"/>
-    <w:lsdException w:name="Medium Grid 2 Accent 2" w:semiHidden="0" w:uiPriority="68" w:unhideWhenUsed="0"/>
-    <w:lsdException w:name="Medium Grid 3 Accent 2" w:semiHidden="0" w:uiPriority="69" w:unhideWhenUsed="0"/>
-    <w:lsdException w:name="Dark List Accent 2" w:semiHidden="0" w:uiPriority="70" w:unhideWhenUsed="0"/>
-    <w:lsdException w:name="Colorful Shading Accent 2" w:semiHidden="0" w:uiPriority="71" w:unhideWhenUsed="0"/>
-    <w:lsdException w:name="Colorful List Accent 2" w:semiHidden="0" w:uiPriority="72" w:unhideWhenUsed="0"/>
-    <w:lsdException w:name="Colorful Grid Accent 2" w:semiHidden="0" w:uiPriority="73" w:unhideWhenUsed="0"/>
-    <w:lsdException w:name="Light Shading Accent 3" w:semiHidden="0" w:uiPriority="60" w:unhideWhenUsed="0"/>
-    <w:lsdException w:name="Light List Accent 3" w:semiHidden="0" w:uiPriority="61" w:unhideWhenUsed="0"/>
-    <w:lsdException w:name="Light Grid Accent 3" w:semiHidden="0" w:uiPriority="62" w:unhideWhenUsed="0"/>
-    <w:lsdException w:name="Medium Shading 1 Accent 3" w:semiHidden="0" w:uiPriority="63" w:unhideWhenUsed="0"/>
-    <w:lsdException w:name="Medium Shading 2 Accent 3" w:semiHidden="0" w:uiPriority="64" w:unhideWhenUsed="0"/>
-    <w:lsdException w:name="Medium List 1 Accent 3" w:semiHidden="0" w:uiPriority="65" w:unhideWhenUsed="0"/>
-    <w:lsdException w:name="Medium List 2 Accent 3" w:semiHidden="0" w:uiPriority="66" w:unhideWhenUsed="0"/>
-    <w:lsdException w:name="Medium Grid 1 Accent 3" w:semiHidden="0" w:uiPriority="67" w:unhideWhenUsed="0"/>
-    <w:lsdException w:name="Medium Grid 2 Accent 3" w:semiHidden="0" w:uiPriority="68" w:unhideWhenUsed="0"/>
-    <w:lsdException w:name="Medium Grid 3 Accent 3" w:semiHidden="0" w:uiPriority="69" w:unhideWhenUsed="0"/>
-    <w:lsdException w:name="Dark List Accent 3" w:semiHidden="0" w:uiPriority="70" w:unhideWhenUsed="0"/>
-    <w:lsdException w:name="Colorful Shading Accent 3" w:semiHidden="0" w:uiPriority="71" w:unhideWhenUsed="0"/>
-    <w:lsdException w:name="Colorful List Accent 3" w:semiHidden="0" w:uiPriority="72" w:unhideWhenUsed="0"/>
-    <w:lsdException w:name="Colorful Grid Accent 3" w:semiHidden="0" w:uiPriority="73" w:unhideWhenUsed="0"/>
-    <w:lsdException w:name="Light Shading Accent 4" w:semiHidden="0" w:uiPriority="60" w:unhideWhenUsed="0"/>
-    <w:lsdException w:name="Light List Accent 4" w:semiHidden="0" w:uiPriority="61" w:unhideWhenUsed="0"/>
-    <w:lsdException w:name="Light Grid Accent 4" w:semiHidden="0" w:uiPriority="62" w:unhideWhenUsed="0"/>
-    <w:lsdException w:name="Medium Shading 1 Accent 4" w:semiHidden="0" w:uiPriority="63" w:unhideWhenUsed="0"/>
-    <w:lsdException w:name="Medium Shading 2 Accent 4" w:semiHidden="0" w:uiPriority="64" w:unhideWhenUsed="0"/>
-    <w:lsdException w:name="Medium List 1 Accent 4" w:semiHidden="0" w:uiPriority="65" w:unhideWhenUsed="0"/>
-    <w:lsdException w:name="Medium List 2 Accent 4" w:semiHidden="0" w:uiPriority="66" w:unhideWhenUsed="0"/>
-    <w:lsdException w:name="Medium Grid 1 Accent 4" w:semiHidden="0" w:uiPriority="67" w:unhideWhenUsed="0"/>
-    <w:lsdException w:name="Medium Grid 2 Accent 4" w:semiHidden="0" w:uiPriority="68" w:unhideWhenUsed="0"/>
-    <w:lsdException w:name="Medium Grid 3 Accent 4" w:semiHidden="0" w:uiPriority="69" w:unhideWhenUsed="0"/>
-    <w:lsdException w:name="Dark List Accent 4" w:semiHidden="0" w:uiPriority="70" w:unhideWhenUsed="0"/>
-    <w:lsdException w:name="Colorful Shading Accent 4" w:semiHidden="0" w:uiPriority="71" w:unhideWhenUsed="0"/>
-    <w:lsdException w:name="Colorful List Accent 4" w:semiHidden="0" w:uiPriority="72" w:unhideWhenUsed="0"/>
-    <w:lsdException w:name="Colorful Grid Accent 4" w:semiHidden="0" w:uiPriority="73" w:unhideWhenUsed="0"/>
-    <w:lsdException w:name="Light Shading Accent 5" w:semiHidden="0" w:uiPriority="60" w:unhideWhenUsed="0"/>
-    <w:lsdException w:name="Light List Accent 5" w:semiHidden="0" w:uiPriority="61" w:unhideWhenUsed="0"/>
-    <w:lsdException w:name="Light Grid Accent 5" w:semiHidden="0" w:uiPriority="62" w:unhideWhenUsed="0"/>
-    <w:lsdException w:name="Medium Shading 1 Accent 5" w:semiHidden="0" w:uiPriority="63" w:unhideWhenUsed="0"/>
-    <w:lsdException w:name="Medium Shading 2 Accent 5" w:semiHidden="0" w:uiPriority="64" w:unhideWhenUsed="0"/>
-    <w:lsdException w:name="Medium List 1 Accent 5" w:semiHidden="0" w:uiPriority="65" w:unhideWhenUsed="0"/>
-    <w:lsdException w:name="Medium List 2 Accent 5" w:semiHidden="0" w:uiPriority="66" w:unhideWhenUsed="0"/>
-    <w:lsdException w:name="Medium Grid 1 Accent 5" w:semiHidden="0" w:uiPriority="67" w:unhideWhenUsed="0"/>
-    <w:lsdException w:name="Medium Grid 2 Accent 5" w:semiHidden="0" w:uiPriority="68" w:unhideWhenUsed="0"/>
-    <w:lsdException w:name="Medium Grid 3 Accent 5" w:semiHidden="0" w:uiPriority="69" w:unhideWhenUsed="0"/>
-    <w:lsdException w:name="Dark List Accent 5" w:semiHidden="0" w:uiPriority="70" w:unhideWhenUsed="0"/>
-    <w:lsdException w:name="Colorful Shading Accent 5" w:semiHidden="0" w:uiPriority="71" w:unhideWhenUsed="0"/>
-    <w:lsdException w:name="Colorful List Accent 5" w:semiHidden="0" w:uiPriority="72" w:unhideWhenUsed="0"/>
-    <w:lsdException w:name="Colorful Grid Accent 5" w:semiHidden="0" w:uiPriority="73" w:unhideWhenUsed="0"/>
-    <w:lsdException w:name="Light Shading Accent 6" w:semiHidden="0" w:uiPriority="60" w:unhideWhenUsed="0"/>
-    <w:lsdException w:name="Light List Accent 6" w:semiHidden="0" w:uiPriority="61" w:unhideWhenUsed="0"/>
-    <w:lsdException w:name="Light Grid Accent 6" w:semiHidden="0" w:uiPriority="62" w:unhideWhenUsed="0"/>
-    <w:lsdException w:name="Medium Shading 1 Accent 6" w:semiHidden="0" w:uiPriority="63" w:unhideWhenUsed="0"/>
-    <w:lsdException w:name="Medium Shading 2 Accent 6" w:semiHidden="0" w:uiPriority="64" w:unhideWhenUsed="0"/>
-    <w:lsdException w:name="Medium List 1 Accent 6" w:semiHidden="0" w:uiPriority="65" w:unhideWhenUsed="0"/>
-    <w:lsdException w:name="Medium List 2 Accent 6" w:semiHidden="0" w:uiPriority="66" w:unhideWhenUsed="0"/>
-    <w:lsdException w:name="Medium Grid 1 Accent 6" w:semiHidden="0" w:uiPriority="67" w:unhideWhenUsed="0"/>
-    <w:lsdException w:name="Medium Grid 2 Accent 6" w:semiHidden="0" w:uiPriority="68" w:unhideWhenUsed="0"/>
-    <w:lsdException w:name="Medium Grid 3 Accent 6" w:semiHidden="0" w:uiPriority="69" w:unhideWhenUsed="0"/>
-    <w:lsdException w:name="Dark List Accent 6" w:semiHidden="0" w:uiPriority="70" w:unhideWhenUsed="0"/>
-    <w:lsdException w:name="Colorful Shading Accent 6" w:semiHidden="0" w:uiPriority="71" w:unhideWhenUsed="0"/>
-    <w:lsdException w:name="Colorful List Accent 6" w:semiHidden="0" w:uiPriority="72" w:unhideWhenUsed="0"/>
-    <w:lsdException w:name="Colorful Grid Accent 6" w:semiHidden="0" w:uiPriority="73" w:unhideWhenUsed="0"/>
-    <w:lsdException w:name="Subtle Emphasis" w:semiHidden="0" w:uiPriority="19" w:unhideWhenUsed="0" w:qFormat="1"/>
-    <w:lsdException w:name="Intense Emphasis" w:semiHidden="0" w:uiPriority="21" w:unhideWhenUsed="0" w:qFormat="1"/>
-    <w:lsdException w:name="Subtle Reference" w:semiHidden="0" w:uiPriority="31" w:unhideWhenUsed="0" w:qFormat="1"/>
-    <w:lsdException w:name="Intense Reference" w:semiHidden="0" w:uiPriority="32" w:unhideWhenUsed="0" w:qFormat="1"/>
-    <w:lsdException w:name="Book Title" w:semiHidden="0" w:uiPriority="33" w:unhideWhenUsed="0" w:qFormat="1"/>
-    <w:lsdException w:name="Bibliography" w:uiPriority="37"/>
-    <w:lsdException w:name="TOC Heading" w:uiPriority="39" w:qFormat="1"/>
-  </w:latentStyles>
-  <w:style w:type="paragraph" w:default="1" w:styleId="Normal">
-    <w:name w:val="Normal"/>
-    <w:uiPriority w:val="1"/>
-    <w:qFormat/>
-    <w:rPr>
-      <w:rFonts w:ascii="Arial MT" w:eastAsia="Arial MT" w:hAnsi="Arial MT" w:cs="Arial MT"/>
-    </w:rPr>
-  </w:style>
-  <w:style w:type="paragraph" w:styleId="Heading1">
-    <w:name w:val="heading 1"/>
-    <w:basedOn w:val="Normal"/>
-    <w:uiPriority w:val="1"/>
-    <w:qFormat/>
-    <w:pPr>
-      <w:ind w:left="594"/>
-      <w:outlineLvl w:val="0"/>
-    </w:pPr>
-    <w:rPr>
-      <w:rFonts w:ascii="Arial Black" w:eastAsia="Arial Black" w:hAnsi="Arial Black" w:cs="Arial Black"/>
-      <w:b/>
-      <w:bCs/>
-      <w:sz w:val="26"/>
-      <w:szCs w:val="26"/>
-    </w:rPr>
-  </w:style>
-  <w:style w:type="paragraph" w:styleId="Heading2">
-    <w:name w:val="heading 2"/>
-    <w:basedOn w:val="Normal"/>
-    <w:uiPriority w:val="1"/>
-    <w:qFormat/>
-    <w:pPr>
-      <w:outlineLvl w:val="1"/>
-    </w:pPr>
-    <w:rPr>
-      <w:rFonts w:ascii="Arial Black" w:eastAsia="Arial Black" w:hAnsi="Arial Black" w:cs="Arial Black"/>
-      <w:b/>
-      <w:bCs/>
-      <w:sz w:val="24"/>
-      <w:szCs w:val="24"/>
-    </w:rPr>
-  </w:style>
-  <w:style w:type="character" w:default="1" w:styleId="DefaultParagraphFont">
-    <w:name w:val="Default Paragraph Font"/>
-    <w:uiPriority w:val="1"/>
-    <w:semiHidden/>
-    <w:unhideWhenUsed/>
-  </w:style>
-  <w:style w:type="table" w:default="1" w:styleId="TableNormal">
-    <w:name w:val="Normal Table"/>
-    <w:uiPriority w:val="99"/>
-    <w:semiHidden/>
-    <w:unhideWhenUsed/>
-    <w:tblPr>
-      <w:tblInd w:w="0" w:type="dxa"/>
-      <w:tblCellMar>
-        <w:top w:w="0" w:type="dxa"/>
-        <w:left w:w="108" w:type="dxa"/>
-        <w:bottom w:w="0" w:type="dxa"/>
-        <w:right w:w="108" w:type="dxa"/>
-      </w:tblCellMar>
-    </w:tblPr>
-  </w:style>
-  <w:style w:type="numbering" w:default="1" w:styleId="NoList">
-    <w:name w:val="No List"/>
-    <w:uiPriority w:val="99"/>
-    <w:semiHidden/>
-    <w:unhideWhenUsed/>
-  </w:style>
-  <w:style w:type="paragraph" w:styleId="BodyText">
-    <w:name w:val="Body Text"/>
-    <w:basedOn w:val="Normal"/>
-    <w:uiPriority w:val="1"/>
-    <w:qFormat/>
-    <w:rPr>
-      <w:sz w:val="23"/>
-      <w:szCs w:val="23"/>
-    </w:rPr>
-  </w:style>
-  <w:style w:type="paragraph" w:styleId="ListParagraph">
-    <w:name w:val="List Paragraph"/>
-    <w:basedOn w:val="Normal"/>
-    <w:uiPriority w:val="1"/>
-    <w:qFormat/>
-  </w:style>
-  <w:style w:type="paragraph" w:customStyle="1" w:styleId="TableParagraph">
-    <w:name w:val="Table Paragraph"/>
-    <w:basedOn w:val="Normal"/>
-    <w:uiPriority w:val="1"/>
-    <w:qFormat/>
-  </w:style>
-  <w:style w:type="paragraph" w:styleId="BalloonText">
-    <w:name w:val="Balloon Text"/>
-    <w:basedOn w:val="Normal"/>
-    <w:link w:val="BalloonTextChar"/>
-    <w:uiPriority w:val="99"/>
-    <w:semiHidden/>
-    <w:unhideWhenUsed/>
-    <w:rsid w:val="008A2E1B"/>
-    <w:rPr>
-      <w:rFonts w:ascii="Tahoma" w:hAnsi="Tahoma" w:cs="Tahoma"/>
-      <w:sz w:val="16"/>
-      <w:szCs w:val="16"/>
-    </w:rPr>
-  </w:style>
-  <w:style w:type="character" w:customStyle="1" w:styleId="BalloonTextChar">
-    <w:name w:val="Balloon Text Char"/>
-    <w:basedOn w:val="DefaultParagraphFont"/>
-    <w:link w:val="BalloonText"/>
-    <w:uiPriority w:val="99"/>
-    <w:semiHidden/>
-    <w:rsid w:val="008A2E1B"/>
-    <w:rPr>
-      <w:rFonts w:ascii="Tahoma" w:eastAsia="Arial MT" w:hAnsi="Tahoma" w:cs="Tahoma"/>
-      <w:sz w:val="16"/>
-      <w:szCs w:val="16"/>
-    </w:rPr>
-  </w:style>
-</w:styles>
-</file>
-
-<file path=word/stylesWithEffects.xml><?xml version="1.0" encoding="utf-8"?>
-<w:styles xmlns:wpc="http://schemas.microsoft.com/office/word/2010/wordprocessingCanvas" xmlns:mc="http://schemas.openxmlformats.org/markup-compatibility/2006" xmlns:o="urn:schemas-microsoft-com:office:office" xmlns:r="http://schemas.openxmlformats.org/officeDocument/2006/relationships" xmlns:m="http://schemas.openxmlformats.org/officeDocument/2006/math" xmlns:v="urn:schemas-microsoft-com:vml" xmlns:wp14="http://schemas.microsoft.com/office/word/2010/wordprocessingDrawing" xmlns:wp="http://schemas.openxmlformats.org/drawingml/2006/wordprocessingDrawing" xmlns:w10="urn:schemas-microsoft-com:office:word" xmlns:w="http://schemas.openxmlformats.org/wordprocessingml/2006/main" xmlns:w14="http://schemas.microsoft.com/office/word/2010/wordml" xmlns:wpg="http://schemas.microsoft.com/office/word/2010/wordprocessingGroup" xmlns:wpi="http://schemas.microsoft.com/office/word/2010/wordprocessingInk" xmlns:wne="http://schemas.microsoft.com/office/word/2006/wordml" xmlns:wps="http://schemas.microsoft.com/office/word/2010/wordprocessingShape" mc:Ignorable="w14 wp14">
-  <w:docDefaults>
-    <w:rPrDefault>
-      <w:rPr>
-        <w:rFonts w:asciiTheme="minorHAnsi" w:eastAsiaTheme="minorHAnsi" w:hAnsiTheme="minorHAnsi" w:cstheme="minorBidi"/>
-        <w:sz w:val="22"/>
-        <w:szCs w:val="22"/>
-        <w:lang w:val="en-US" w:eastAsia="en-US" w:bidi="ar-SA"/>
-      </w:rPr>
-    </w:rPrDefault>
-    <w:pPrDefault>
-      <w:pPr>
-        <w:widowControl w:val="0"/>
-        <w:autoSpaceDE w:val="0"/>
-        <w:autoSpaceDN w:val="0"/>
-      </w:pPr>
-    </w:pPrDefault>
-  </w:docDefaults>
-  <w:latentStyles w:defLockedState="0" w:defUIPriority="99" w:defSemiHidden="1" w:defUnhideWhenUsed="1" w:defQFormat="0" w:count="267">
-    <w:lsdException w:name="Normal" w:semiHidden="0" w:uiPriority="0" w:unhideWhenUsed="0" w:qFormat="1"/>
-    <w:lsdException w:name="heading 1" w:semiHidden="0" w:uiPriority="9" w:unhideWhenUsed="0" w:qFormat="1"/>
-    <w:lsdException w:name="heading 2" w:uiPriority="9" w:qFormat="1"/>
-    <w:lsdException w:name="heading 3" w:uiPriority="9" w:qFormat="1"/>
-    <w:lsdException w:name="heading 4" w:uiPriority="9" w:qFormat="1"/>
-    <w:lsdException w:name="heading 5" w:uiPriority="9" w:qFormat="1"/>
-    <w:lsdException w:name="heading 6" w:uiPriority="9" w:qFormat="1"/>
-    <w:lsdException w:name="heading 7" w:uiPriority="9" w:qFormat="1"/>
-    <w:lsdException w:name="heading 8" w:uiPriority="9" w:qFormat="1"/>
-    <w:lsdException w:name="heading 9" w:uiPriority="9" w:qFormat="1"/>
-    <w:lsdException w:name="toc 1" w:uiPriority="39"/>
-    <w:lsdException w:name="toc 2" w:uiPriority="39"/>
-    <w:lsdException w:name="toc 3" w:uiPriority="39"/>
-    <w:lsdException w:name="toc 4" w:uiPriority="39"/>
-    <w:lsdException w:name="toc 5" w:uiPriority="39"/>
-    <w:lsdException w:name="toc 6" w:uiPriority="39"/>
-    <w:lsdException w:name="toc 7" w:uiPriority="39"/>
-    <w:lsdException w:name="toc 8" w:uiPriority="39"/>
-    <w:lsdException w:name="toc 9" w:uiPriority="39"/>
-    <w:lsdException w:name="caption" w:uiPriority="35" w:qFormat="1"/>
-    <w:lsdException w:name="Title" w:semiHidden="0" w:uiPriority="10" w:unhideWhenUsed="0" w:qFormat="1"/>
-    <w:lsdException w:name="Default Paragraph Font" w:uiPriority="1"/>
-    <w:lsdException w:name="Subtitle" w:semiHidden="0" w:uiPriority="11" w:unhideWhenUsed="0" w:qFormat="1"/>
-    <w:lsdException w:name="Strong" w:semiHidden="0" w:uiPriority="22" w:unhideWhenUsed="0" w:qFormat="1"/>
-    <w:lsdException w:name="Emphasis" w:semiHidden="0" w:uiPriority="20" w:unhideWhenUsed="0" w:qFormat="1"/>
-    <w:lsdException w:name="Table Grid" w:semiHidden="0" w:uiPriority="59" w:unhideWhenUsed="0"/>
-    <w:lsdException w:name="Placeholder Text" w:unhideWhenUsed="0"/>
-    <w:lsdException w:name="No Spacing" w:semiHidden="0" w:uiPriority="1" w:unhideWhenUsed="0" w:qFormat="1"/>
-    <w:lsdException w:name="Light Shading" w:semiHidden="0" w:uiPriority="60" w:unhideWhenUsed="0"/>
-    <w:lsdException w:name="Light List" w:semiHidden="0" w:uiPriority="61" w:unhideWhenUsed="0"/>
-    <w:lsdException w:name="Light Grid" w:semiHidden="0" w:uiPriority="62" w:unhideWhenUsed="0"/>
-    <w:lsdException w:name="Medium Shading 1" w:semiHidden="0" w:uiPriority="63" w:unhideWhenUsed="0"/>
-    <w:lsdException w:name="Medium Shading 2" w:semiHidden="0" w:uiPriority="64" w:unhideWhenUsed="0"/>
-    <w:lsdException w:name="Medium List 1" w:semiHidden="0" w:uiPriority="65" w:unhideWhenUsed="0"/>
-    <w:lsdException w:name="Medium List 2" w:semiHidden="0" w:uiPriority="66" w:unhideWhenUsed="0"/>
-    <w:lsdException w:name="Medium Grid 1" w:semiHidden="0" w:uiPriority="67" w:unhideWhenUsed="0"/>
-    <w:lsdException w:name="Medium Grid 2" w:semiHidden="0" w:uiPriority="68" w:unhideWhenUsed="0"/>
-    <w:lsdException w:name="Medium Grid 3" w:semiHidden="0" w:uiPriority="69" w:unhideWhenUsed="0"/>
-    <w:lsdException w:name="Dark List" w:semiHidden="0" w:uiPriority="70" w:unhideWhenUsed="0"/>
-    <w:lsdException w:name="Colorful Shading" w:semiHidden="0" w:uiPriority="71" w:unhideWhenUsed="0"/>
-    <w:lsdException w:name="Colorful List" w:semiHidden="0" w:uiPriority="72" w:unhideWhenUsed="0"/>
-    <w:lsdException w:name="Colorful Grid" w:semiHidden="0" w:uiPriority="73" w:unhideWhenUsed="0"/>
-    <w:lsdException w:name="Light Shading Accent 1" w:semiHidden="0" w:uiPriority="60" w:unhideWhenUsed="0"/>
-    <w:lsdException w:name="Light List Accent 1" w:semiHidden="0" w:uiPriority="61" w:unhideWhenUsed="0"/>
-    <w:lsdException w:name="Light Grid Accent 1" w:semiHidden="0" w:uiPriority="62" w:unhideWhenUsed="0"/>
-    <w:lsdException w:name="Medium Shading 1 Accent 1" w:semiHidden="0" w:uiPriority="63" w:unhideWhenUsed="0"/>
-    <w:lsdException w:name="Medium Shading 2 Accent 1" w:semiHidden="0" w:uiPriority="64" w:unhideWhenUsed="0"/>
-    <w:lsdException w:name="Medium List 1 Accent 1" w:semiHidden="0" w:uiPriority="65" w:unhideWhenUsed="0"/>
-    <w:lsdException w:name="Revision" w:unhideWhenUsed="0"/>
-    <w:lsdException w:name="List Paragraph" w:semiHidden="0" w:uiPriority="34" w:unhideWhenUsed="0" w:qFormat="1"/>
-    <w:lsdException w:name="Quote" w:semiHidden="0" w:uiPriority="29" w:unhideWhenUsed="0" w:qFormat="1"/>
-    <w:lsdException w:name="Intense Quote" w:semiHidden="0" w:uiPriority="30" w:unhideWhenUsed="0" w:qFormat="1"/>
-    <w:lsdException w:name="Medium List 2 Accent 1" w:semiHidden="0" w:uiPriority="66" w:unhideWhenUsed="0"/>
-    <w:lsdException w:name="Medium Grid 1 Accent 1" w:semiHidden="0" w:uiPriority="67" w:unhideWhenUsed="0"/>
-    <w:lsdException w:name="Medium Grid 2 Accent 1" w:semiHidden="0" w:uiPriority="68" w:unhideWhenUsed="0"/>
-    <w:lsdException w:name="Medium Grid 3 Accent 1" w:semiHidden="0" w:uiPriority="69" w:unhideWhenUsed="0"/>
-    <w:lsdException w:name="Dark List Accent 1" w:semiHidden="0" w:uiPriority="70" w:unhideWhenUsed="0"/>
-    <w:lsdException w:name="Colorful Shading Accent 1" w:semiHidden="0" w:uiPriority="71" w:unhideWhenUsed="0"/>
-    <w:lsdException w:name="Colorful List Accent 1" w:semiHidden="0" w:uiPriority="72" w:unhideWhenUsed="0"/>
-    <w:lsdException w:name="Colorful Grid Accent 1" w:semiHidden="0" w:uiPriority="73" w:unhideWhenUsed="0"/>
-    <w:lsdException w:name="Light Shading Accent 2" w:semiHidden="0" w:uiPriority="60" w:unhideWhenUsed="0"/>
-    <w:lsdException w:name="Light List Accent 2" w:semiHidden="0" w:uiPriority="61" w:unhideWhenUsed="0"/>
-    <w:lsdException w:name="Light Grid Accent 2" w:semiHidden="0" w:uiPriority="62" w:unhideWhenUsed="0"/>
-    <w:lsdException w:name="Medium Shading 1 Accent 2" w:semiHidden="0" w:uiPriority="63" w:unhideWhenUsed="0"/>
-    <w:lsdException w:name="Medium Shading 2 Accent 2" w:semiHidden="0" w:uiPriority="64" w:unhideWhenUsed="0"/>
-    <w:lsdException w:name="Medium List 1 Accent 2" w:semiHidden="0" w:uiPriority="65" w:unhideWhenUsed="0"/>
-    <w:lsdException w:name="Medium List 2 Accent 2" w:semiHidden="0" w:uiPriority="66" w:unhideWhenUsed="0"/>
-    <w:lsdException w:name="Medium Grid 1 Accent 2" w:semiHidden="0" w:uiPriority="67" w:unhideWhenUsed="0"/>
-    <w:lsdException w:name="Medium Grid 2 Accent 2" w:semiHidden="0" w:uiPriority="68" w:unhideWhenUsed="0"/>
-    <w:lsdException w:name="Medium Grid 3 Accent 2" w:semiHidden="0" w:uiPriority="69" w:unhideWhenUsed="0"/>
-    <w:lsdException w:name="Dark List Accent 2" w:semiHidden="0" w:uiPriority="70" w:unhideWhenUsed="0"/>
-    <w:lsdException w:name="Colorful Shading Accent 2" w:semiHidden="0" w:uiPriority="71" w:unhideWhenUsed="0"/>
-    <w:lsdException w:name="Colorful List Accent 2" w:semiHidden="0" w:uiPriority="72" w:unhideWhenUsed="0"/>
-    <w:lsdException w:name="Colorful Grid Accent 2" w:semiHidden="0" w:uiPriority="73" w:unhideWhenUsed="0"/>
-    <w:lsdException w:name="Light Shading Accent 3" w:semiHidden="0" w:uiPriority="60" w:unhideWhenUsed="0"/>
-    <w:lsdException w:name="Light List Accent 3" w:semiHidden="0" w:uiPriority="61" w:unhideWhenUsed="0"/>
-    <w:lsdException w:name="Light Grid Accent 3" w:semiHidden="0" w:uiPriority="62" w:unhideWhenUsed="0"/>
-    <w:lsdException w:name="Medium Shading 1 Accent 3" w:semiHidden="0" w:uiPriority="63" w:unhideWhenUsed="0"/>
-    <w:lsdException w:name="Medium Shading 2 Accent 3" w:semiHidden="0" w:uiPriority="64" w:unhideWhenUsed="0"/>
-    <w:lsdException w:name="Medium List 1 Accent 3" w:semiHidden="0" w:uiPriority="65" w:unhideWhenUsed="0"/>
-    <w:lsdException w:name="Medium List 2 Accent 3" w:semiHidden="0" w:uiPriority="66" w:unhideWhenUsed="0"/>
-    <w:lsdException w:name="Medium Grid 1 Accent 3" w:semiHidden="0" w:uiPriority="67" w:unhideWhenUsed="0"/>
-    <w:lsdException w:name="Medium Grid 2 Accent 3" w:semiHidden="0" w:uiPriority="68" w:unhideWhenUsed="0"/>
-    <w:lsdException w:name="Medium Grid 3 Accent 3" w:semiHidden="0" w:uiPriority="69" w:unhideWhenUsed="0"/>
-    <w:lsdException w:name="Dark List Accent 3" w:semiHidden="0" w:uiPriority="70" w:unhideWhenUsed="0"/>
-    <w:lsdException w:name="Colorful Shading Accent 3" w:semiHidden="0" w:uiPriority="71" w:unhideWhenUsed="0"/>
-    <w:lsdException w:name="Colorful List Accent 3" w:semiHidden="0" w:uiPriority="72" w:unhideWhenUsed="0"/>
-    <w:lsdException w:name="Colorful Grid Accent 3" w:semiHidden="0" w:uiPriority="73" w:unhideWhenUsed="0"/>
-    <w:lsdException w:name="Light Shading Accent 4" w:semiHidden="0" w:uiPriority="60" w:unhideWhenUsed="0"/>
-    <w:lsdException w:name="Light List Accent 4" w:semiHidden="0" w:uiPriority="61" w:unhideWhenUsed="0"/>
-    <w:lsdException w:name="Light Grid Accent 4" w:semiHidden="0" w:uiPriority="62" w:unhideWhenUsed="0"/>
-    <w:lsdException w:name="Medium Shading 1 Accent 4" w:semiHidden="0" w:uiPriority="63" w:unhideWhenUsed="0"/>
-    <w:lsdException w:name="Medium Shading 2 Accent 4" w:semiHidden="0" w:uiPriority="64" w:unhideWhenUsed="0"/>
-    <w:lsdException w:name="Medium List 1 Accent 4" w:semiHidden="0" w:uiPriority="65" w:unhideWhenUsed="0"/>
-    <w:lsdException w:name="Medium List 2 Accent 4" w:semiHidden="0" w:uiPriority="66" w:unhideWhenUsed="0"/>
-    <w:lsdException w:name="Medium Grid 1 Accent 4" w:semiHidden="0" w:uiPriority="67" w:unhideWhenUsed="0"/>
-    <w:lsdException w:name="Medium Grid 2 Accent 4" w:semiHidden="0" w:uiPriority="68" w:unhideWhenUsed="0"/>
-    <w:lsdException w:name="Medium Grid 3 Accent 4" w:semiHidden="0" w:uiPriority="69" w:unhideWhenUsed="0"/>
-    <w:lsdException w:name="Dark List Accent 4" w:semiHidden="0" w:uiPriority="70" w:unhideWhenUsed="0"/>
-    <w:lsdException w:name="Colorful Shading Accent 4" w:semiHidden="0" w:uiPriority="71" w:unhideWhenUsed="0"/>
-    <w:lsdException w:name="Colorful List Accent 4" w:semiHidden="0" w:uiPriority="72" w:unhideWhenUsed="0"/>
-    <w:lsdException w:name="Colorful Grid Accent 4" w:semiHidden="0" w:uiPriority="73" w:unhideWhenUsed="0"/>
-    <w:lsdException w:name="Light Shading Accent 5" w:semiHidden="0" w:uiPriority="60" w:unhideWhenUsed="0"/>
-    <w:lsdException w:name="Light List Accent 5" w:semiHidden="0" w:uiPriority="61" w:unhideWhenUsed="0"/>
-    <w:lsdException w:name="Light Grid Accent 5" w:semiHidden="0" w:uiPriority="62" w:unhideWhenUsed="0"/>
-    <w:lsdException w:name="Medium Shading 1 Accent 5" w:semiHidden="0" w:uiPriority="63" w:unhideWhenUsed="0"/>
-    <w:lsdException w:name="Medium Shading 2 Accent 5" w:semiHidden="0" w:uiPriority="64" w:unhideWhenUsed="0"/>
-    <w:lsdException w:name="Medium List 1 Accent 5" w:semiHidden="0" w:uiPriority="65" w:unhideWhenUsed="0"/>
-    <w:lsdException w:name="Medium List 2 Accent 5" w:semiHidden="0" w:uiPriority="66" w:unhideWhenUsed="0"/>
-    <w:lsdException w:name="Medium Grid 1 Accent 5" w:semiHidden="0" w:uiPriority="67" w:unhideWhenUsed="0"/>
-    <w:lsdException w:name="Medium Grid 2 Accent 5" w:semiHidden="0" w:uiPriority="68" w:unhideWhenUsed="0"/>
-    <w:lsdException w:name="Medium Grid 3 Accent 5" w:semiHidden="0" w:uiPriority="69" w:unhideWhenUsed="0"/>
-    <w:lsdException w:name="Dark List Accent 5" w:semiHidden="0" w:uiPriority="70" w:unhideWhenUsed="0"/>
-    <w:lsdException w:name="Colorful Shading Accent 5" w:semiHidden="0" w:uiPriority="71" w:unhideWhenUsed="0"/>
-    <w:lsdException w:name="Colorful List Accent 5" w:semiHidden="0" w:uiPriority="72" w:unhideWhenUsed="0"/>
-    <w:lsdException w:name="Colorful Grid Accent 5" w:semiHidden="0" w:uiPriority="73" w:unhideWhenUsed="0"/>
-    <w:lsdException w:name="Light Shading Accent 6" w:semiHidden="0" w:uiPriority="60" w:unhideWhenUsed="0"/>
-    <w:lsdException w:name="Light List Accent 6" w:semiHidden="0" w:uiPriority="61" w:unhideWhenUsed="0"/>
-    <w:lsdException w:name="Light Grid Accent 6" w:semiHidden="0" w:uiPriority="62" w:unhideWhenUsed="0"/>
-    <w:lsdException w:name="Medium Shading 1 Accent 6" w:semiHidden="0" w:uiPriority="63" w:unhideWhenUsed="0"/>
-    <w:lsdException w:name="Medium Shading 2 Accent 6" w:semiHidden="0" w:uiPriority="64" w:unhideWhenUsed="0"/>
-    <w:lsdException w:name="Medium List 1 Accent 6" w:semiHidden="0" w:uiPriority="65" w:unhideWhenUsed="0"/>
-    <w:lsdException w:name="Medium List 2 Accent 6" w:semiHidden="0" w:uiPriority="66" w:unhideWhenUsed="0"/>
-    <w:lsdException w:name="Medium Grid 1 Accent 6" w:semiHidden="0" w:uiPriority="67" w:unhideWhenUsed="0"/>
-    <w:lsdException w:name="Medium Grid 2 Accent 6" w:semiHidden="0" w:uiPriority="68" w:unhideWhenUsed="0"/>
-    <w:lsdException w:name="Medium Grid 3 Accent 6" w:semiHidden="0" w:uiPriority="69" w:unhideWhenUsed="0"/>
-    <w:lsdException w:name="Dark List Accent 6" w:semiHidden="0" w:uiPriority="70" w:unhideWhenUsed="0"/>
-    <w:lsdException w:name="Colorful Shading Accent 6" w:semiHidden="0" w:uiPriority="71" w:unhideWhenUsed="0"/>
-    <w:lsdException w:name="Colorful List Accent 6" w:semiHidden="0" w:uiPriority="72" w:unhideWhenUsed="0"/>
-    <w:lsdException w:name="Colorful Grid Accent 6" w:semiHidden="0" w:uiPriority="73" w:unhideWhenUsed="0"/>
-    <w:lsdException w:name="Subtle Emphasis" w:semiHidden="0" w:uiPriority="19" w:unhideWhenUsed="0" w:qFormat="1"/>
-    <w:lsdException w:name="Intense Emphasis" w:semiHidden="0" w:uiPriority="21" w:unhideWhenUsed="0" w:qFormat="1"/>
-    <w:lsdException w:name="Subtle Reference" w:semiHidden="0" w:uiPriority="31" w:unhideWhenUsed="0" w:qFormat="1"/>
-    <w:lsdException w:name="Intense Reference" w:semiHidden="0" w:uiPriority="32" w:unhideWhenUsed="0" w:qFormat="1"/>
-    <w:lsdException w:name="Book Title" w:semiHidden="0" w:uiPriority="33" w:unhideWhenUsed="0" w:qFormat="1"/>
-    <w:lsdException w:name="Bibliography" w:uiPriority="37"/>
-    <w:lsdException w:name="TOC Heading" w:uiPriority="39" w:qFormat="1"/>
+  <w:latentStyles w:defLockedState="0" w:defUIPriority="99" w:defSemiHidden="0" w:defUnhideWhenUsed="0" w:defQFormat="0" w:count="376">
+    <w:lsdException w:name="Normal" w:uiPriority="0" w:qFormat="1"/>
+    <w:lsdException w:name="heading 1" w:uiPriority="9" w:qFormat="1"/>
+    <w:lsdException w:name="heading 2" w:semiHidden="1" w:uiPriority="9" w:unhideWhenUsed="1" w:qFormat="1"/>
+    <w:lsdException w:name="heading 3" w:semiHidden="1" w:uiPriority="9" w:unhideWhenUsed="1" w:qFormat="1"/>
+    <w:lsdException w:name="heading 4" w:semiHidden="1" w:uiPriority="9" w:unhideWhenUsed="1" w:qFormat="1"/>
+    <w:lsdException w:name="heading 5" w:semiHidden="1" w:uiPriority="9" w:unhideWhenUsed="1" w:qFormat="1"/>
+    <w:lsdException w:name="heading 6" w:semiHidden="1" w:uiPriority="9" w:unhideWhenUsed="1" w:qFormat="1"/>
+    <w:lsdException w:name="heading 7" w:semiHidden="1" w:uiPriority="9" w:unhideWhenUsed="1" w:qFormat="1"/>
+    <w:lsdException w:name="heading 8" w:semiHidden="1" w:uiPriority="9" w:unhideWhenUsed="1" w:qFormat="1"/>
+    <w:lsdException w:name="heading 9" w:semiHidden="1" w:uiPriority="9" w:unhideWhenUsed="1" w:qFormat="1"/>
+    <w:lsdException w:name="index 1" w:semiHidden="1" w:unhideWhenUsed="1"/>
+    <w:lsdException w:name="index 2" w:semiHidden="1" w:unhideWhenUsed="1"/>
+    <w:lsdException w:name="index 3" w:semiHidden="1" w:unhideWhenUsed="1"/>
+    <w:lsdException w:name="index 4" w:semiHidden="1" w:unhideWhenUsed="1"/>
+    <w:lsdException w:name="index 5" w:semiHidden="1" w:unhideWhenUsed="1"/>
+    <w:lsdException w:name="index 6" w:semiHidden="1" w:unhideWhenUsed="1"/>
+    <w:lsdException w:name="index 7" w:semiHidden="1" w:unhideWhenUsed="1"/>
+    <w:lsdException w:name="index 8" w:semiHidden="1" w:unhideWhenUsed="1"/>
+    <w:lsdException w:name="index 9" w:semiHidden="1" w:unhideWhenUsed="1"/>
+    <w:lsdException w:name="toc 1" w:semiHidden="1" w:uiPriority="39" w:unhideWhenUsed="1"/>
+    <w:lsdException w:name="toc 2" w:semiHidden="1" w:uiPriority="39" w:unhideWhenUsed="1"/>
+    <w:lsdException w:name="toc 3" w:semiHidden="1" w:uiPriority="39" w:unhideWhenUsed="1"/>
+    <w:lsdException w:name="toc 4" w:semiHidden="1" w:uiPriority="39" w:unhideWhenUsed="1"/>
+    <w:lsdException w:name="toc 5" w:semiHidden="1" w:uiPriority="39" w:unhideWhenUsed="1"/>
+    <w:lsdException w:name="toc 6" w:semiHidden="1" w:uiPriority="39" w:unhideWhenUsed="1"/>
+    <w:lsdException w:name="toc 7" w:semiHidden="1" w:uiPriority="39" w:unhideWhenUsed="1"/>
+    <w:lsdException w:name="toc 8" w:semiHidden="1" w:uiPriority="39" w:unhideWhenUsed="1"/>
+    <w:lsdException w:name="toc 9" w:semiHidden="1" w:uiPriority="39" w:unhideWhenUsed="1"/>
+    <w:lsdException w:name="Normal Indent" w:semiHidden="1" w:unhideWhenUsed="1"/>
+    <w:lsdException w:name="footnote text" w:semiHidden="1" w:unhideWhenUsed="1"/>
+    <w:lsdException w:name="annotation text" w:semiHidden="1" w:unhideWhenUsed="1"/>
+    <w:lsdException w:name="header" w:semiHidden="1" w:unhideWhenUsed="1"/>
+    <w:lsdException w:name="footer" w:semiHidden="1" w:unhideWhenUsed="1"/>
+    <w:lsdException w:name="index heading" w:semiHidden="1" w:unhideWhenUsed="1"/>
+    <w:lsdException w:name="caption" w:semiHidden="1" w:uiPriority="35" w:unhideWhenUsed="1" w:qFormat="1"/>
+    <w:lsdException w:name="table of figures" w:semiHidden="1" w:unhideWhenUsed="1"/>
+    <w:lsdException w:name="envelope address" w:semiHidden="1" w:unhideWhenUsed="1"/>
+    <w:lsdException w:name="envelope return" w:semiHidden="1" w:unhideWhenUsed="1"/>
+    <w:lsdException w:name="footnote reference" w:semiHidden="1" w:unhideWhenUsed="1"/>
+    <w:lsdException w:name="annotation reference" w:semiHidden="1" w:unhideWhenUsed="1"/>
+    <w:lsdException w:name="line number" w:semiHidden="1" w:unhideWhenUsed="1"/>
+    <w:lsdException w:name="page number" w:semiHidden="1" w:unhideWhenUsed="1"/>
+    <w:lsdException w:name="endnote reference" w:semiHidden="1" w:unhideWhenUsed="1"/>
+    <w:lsdException w:name="endnote text" w:semiHidden="1" w:unhideWhenUsed="1"/>
+    <w:lsdException w:name="table of authorities" w:semiHidden="1" w:unhideWhenUsed="1"/>
+    <w:lsdException w:name="macro" w:semiHidden="1" w:unhideWhenUsed="1"/>
+    <w:lsdException w:name="toa heading" w:semiHidden="1" w:unhideWhenUsed="1"/>
+    <w:lsdException w:name="List" w:semiHidden="1" w:unhideWhenUsed="1"/>
+    <w:lsdException w:name="List Bullet" w:semiHidden="1" w:unhideWhenUsed="1"/>
+    <w:lsdException w:name="List Number" w:semiHidden="1" w:unhideWhenUsed="1"/>
+    <w:lsdException w:name="List 2" w:semiHidden="1" w:unhideWhenUsed="1"/>
+    <w:lsdException w:name="List 3" w:semiHidden="1" w:unhideWhenUsed="1"/>
+    <w:lsdException w:name="List 4" w:semiHidden="1" w:unhideWhenUsed="1"/>
+    <w:lsdException w:name="List 5" w:semiHidden="1" w:unhideWhenUsed="1"/>
+    <w:lsdException w:name="List Bullet 2" w:semiHidden="1" w:unhideWhenUsed="1"/>
+    <w:lsdException w:name="List Bullet 3" w:semiHidden="1" w:unhideWhenUsed="1"/>
+    <w:lsdException w:name="List Bullet 4" w:semiHidden="1" w:unhideWhenUsed="1"/>
+    <w:lsdException w:name="List Bullet 5" w:semiHidden="1" w:unhideWhenUsed="1"/>
+    <w:lsdException w:name="List Number 2" w:semiHidden="1" w:unhideWhenUsed="1"/>
+    <w:lsdException w:name="List Number 3" w:semiHidden="1" w:unhideWhenUsed="1"/>
+    <w:lsdException w:name="List Number 4" w:semiHidden="1" w:unhideWhenUsed="1"/>
+    <w:lsdException w:name="List Number 5" w:semiHidden="1" w:unhideWhenUsed="1"/>
+    <w:lsdException w:name="Title" w:uiPriority="10" w:qFormat="1"/>
+    <w:lsdException w:name="Closing" w:semiHidden="1" w:unhideWhenUsed="1"/>
+    <w:lsdException w:name="Signature" w:semiHidden="1" w:unhideWhenUsed="1"/>
+    <w:lsdException w:name="Default Paragraph Font" w:semiHidden="1" w:uiPriority="1" w:unhideWhenUsed="1"/>
+    <w:lsdException w:name="Body Text" w:semiHidden="1" w:unhideWhenUsed="1"/>
+    <w:lsdException w:name="Body Text Indent" w:semiHidden="1" w:unhideWhenUsed="1"/>
+    <w:lsdException w:name="List Continue" w:semiHidden="1" w:unhideWhenUsed="1"/>
+    <w:lsdException w:name="List Continue 2" w:semiHidden="1" w:unhideWhenUsed="1"/>
+    <w:lsdException w:name="List Continue 3" w:semiHidden="1" w:unhideWhenUsed="1"/>
+    <w:lsdException w:name="List Continue 4" w:semiHidden="1" w:unhideWhenUsed="1"/>
+    <w:lsdException w:name="List Continue 5" w:semiHidden="1" w:unhideWhenUsed="1"/>
+    <w:lsdException w:name="Message Header" w:semiHidden="1" w:unhideWhenUsed="1"/>
+    <w:lsdException w:name="Subtitle" w:uiPriority="11" w:qFormat="1"/>
+    <w:lsdException w:name="Salutation" w:semiHidden="1" w:unhideWhenUsed="1"/>
+    <w:lsdException w:name="Date" w:semiHidden="1" w:unhideWhenUsed="1"/>
+    <w:lsdException w:name="Body Text First Indent" w:semiHidden="1" w:unhideWhenUsed="1"/>
+    <w:lsdException w:name="Body Text First Indent 2" w:semiHidden="1" w:unhideWhenUsed="1"/>
+    <w:lsdException w:name="Note Heading" w:semiHidden="1" w:unhideWhenUsed="1"/>
+    <w:lsdException w:name="Body Text 2" w:semiHidden="1" w:unhideWhenUsed="1"/>
+    <w:lsdException w:name="Body Text 3" w:semiHidden="1" w:unhideWhenUsed="1"/>
+    <w:lsdException w:name="Body Text Indent 2" w:semiHidden="1" w:unhideWhenUsed="1"/>
+    <w:lsdException w:name="Body Text Indent 3" w:semiHidden="1" w:unhideWhenUsed="1"/>
+    <w:lsdException w:name="Block Text" w:semiHidden="1" w:unhideWhenUsed="1"/>
+    <w:lsdException w:name="Hyperlink" w:semiHidden="1" w:unhideWhenUsed="1"/>
+    <w:lsdException w:name="FollowedHyperlink" w:semiHidden="1" w:unhideWhenUsed="1"/>
+    <w:lsdException w:name="Strong" w:uiPriority="22" w:qFormat="1"/>
+    <w:lsdException w:name="Emphasis" w:uiPriority="20" w:qFormat="1"/>
+    <w:lsdException w:name="Document Map" w:semiHidden="1" w:unhideWhenUsed="1"/>
+    <w:lsdException w:name="Plain Text" w:semiHidden="1" w:unhideWhenUsed="1"/>
+    <w:lsdException w:name="E-mail Signature" w:semiHidden="1" w:unhideWhenUsed="1"/>
+    <w:lsdException w:name="HTML Top of Form" w:semiHidden="1" w:unhideWhenUsed="1"/>
+    <w:lsdException w:name="HTML Bottom of Form" w:semiHidden="1" w:unhideWhenUsed="1"/>
+    <w:lsdException w:name="Normal (Web)" w:semiHidden="1" w:unhideWhenUsed="1"/>
+    <w:lsdException w:name="HTML Acronym" w:semiHidden="1" w:unhideWhenUsed="1"/>
+    <w:lsdException w:name="HTML Address" w:semiHidden="1" w:unhideWhenUsed="1"/>
+    <w:lsdException w:name="HTML Cite" w:semiHidden="1" w:unhideWhenUsed="1"/>
+    <w:lsdException w:name="HTML Code" w:semiHidden="1" w:unhideWhenUsed="1"/>
+    <w:lsdException w:name="HTML Definition" w:semiHidden="1" w:unhideWhenUsed="1"/>
+    <w:lsdException w:name="HTML Keyboard" w:semiHidden="1" w:unhideWhenUsed="1"/>
+    <w:lsdException w:name="HTML Preformatted" w:semiHidden="1" w:unhideWhenUsed="1"/>
+    <w:lsdException w:name="HTML Sample" w:semiHidden="1" w:unhideWhenUsed="1"/>
+    <w:lsdException w:name="HTML Typewriter" w:semiHidden="1" w:unhideWhenUsed="1"/>
+    <w:lsdException w:name="HTML Variable" w:semiHidden="1" w:unhideWhenUsed="1"/>
+    <w:lsdException w:name="Normal Table" w:semiHidden="1" w:unhideWhenUsed="1"/>
+    <w:lsdException w:name="annotation subject" w:semiHidden="1" w:unhideWhenUsed="1"/>
+    <w:lsdException w:name="No List" w:semiHidden="1" w:unhideWhenUsed="1"/>
+    <w:lsdException w:name="Outline List 1" w:semiHidden="1" w:unhideWhenUsed="1"/>
+    <w:lsdException w:name="Outline List 2" w:semiHidden="1" w:unhideWhenUsed="1"/>
+    <w:lsdException w:name="Outline List 3" w:semiHidden="1" w:unhideWhenUsed="1"/>
+    <w:lsdException w:name="Table Simple 1" w:semiHidden="1" w:unhideWhenUsed="1"/>
+    <w:lsdException w:name="Table Simple 2" w:semiHidden="1" w:unhideWhenUsed="1"/>
+    <w:lsdException w:name="Table Simple 3" w:semiHidden="1" w:unhideWhenUsed="1"/>
+    <w:lsdException w:name="Table Classic 1" w:semiHidden="1" w:unhideWhenUsed="1"/>
+    <w:lsdException w:name="Table Classic 2" w:semiHidden="1" w:unhideWhenUsed="1"/>
+    <w:lsdException w:name="Table Classic 3" w:semiHidden="1" w:unhideWhenUsed="1"/>
+    <w:lsdException w:name="Table Classic 4" w:semiHidden="1" w:unhideWhenUsed="1"/>
+    <w:lsdException w:name="Table Colorful 1" w:semiHidden="1" w:unhideWhenUsed="1"/>
+    <w:lsdException w:name="Table Colorful 2" w:semiHidden="1" w:unhideWhenUsed="1"/>
+    <w:lsdException w:name="Table Colorful 3" w:semiHidden="1" w:unhideWhenUsed="1"/>
+    <w:lsdException w:name="Table Columns 1" w:semiHidden="1" w:unhideWhenUsed="1"/>
+    <w:lsdException w:name="Table Columns 2" w:semiHidden="1" w:unhideWhenUsed="1"/>
+    <w:lsdException w:name="Table Columns 3" w:semiHidden="1" w:unhideWhenUsed="1"/>
+    <w:lsdException w:name="Table Columns 4" w:semiHidden="1" w:unhideWhenUsed="1"/>
+    <w:lsdException w:name="Table Columns 5" w:semiHidden="1" w:unhideWhenUsed="1"/>
+    <w:lsdException w:name="Table Grid 1" w:semiHidden="1" w:unhideWhenUsed="1"/>
+    <w:lsdException w:name="Table Grid 2" w:semiHidden="1" w:unhideWhenUsed="1"/>
+    <w:lsdException w:name="Table Grid 3" w:semiHidden="1" w:unhideWhenUsed="1"/>
+    <w:lsdException w:name="Table Grid 4" w:semiHidden="1" w:unhideWhenUsed="1"/>
+    <w:lsdException w:name="Table Grid 5" w:semiHidden="1" w:unhideWhenUsed="1"/>
+    <w:lsdException w:name="Table Grid 6" w:semiHidden="1" w:unhideWhenUsed="1"/>
+    <w:lsdException w:name="Table Grid 7" w:semiHidden="1" w:unhideWhenUsed="1"/>
+    <w:lsdException w:name="Table Grid 8" w:semiHidden="1" w:unhideWhenUsed="1"/>
+    <w:lsdException w:name="Table List 1" w:semiHidden="1" w:unhideWhenUsed="1"/>
+    <w:lsdException w:name="Table List 2" w:semiHidden="1" w:unhideWhenUsed="1"/>
+    <w:lsdException w:name="Table List 3" w:semiHidden="1" w:unhideWhenUsed="1"/>
+    <w:lsdException w:name="Table List 4" w:semiHidden="1" w:unhideWhenUsed="1"/>
+    <w:lsdException w:name="Table List 5" w:semiHidden="1" w:unhideWhenUsed="1"/>
+    <w:lsdException w:name="Table List 6" w:semiHidden="1" w:unhideWhenUsed="1"/>
+    <w:lsdException w:name="Table List 7" w:semiHidden="1" w:unhideWhenUsed="1"/>
+    <w:lsdException w:name="Table List 8" w:semiHidden="1" w:unhideWhenUsed="1"/>
+    <w:lsdException w:name="Table 3D effects 1" w:semiHidden="1" w:unhideWhenUsed="1"/>
+    <w:lsdException w:name="Table 3D effects 2" w:semiHidden="1" w:unhideWhenUsed="1"/>
+    <w:lsdException w:name="Table 3D effects 3" w:semiHidden="1" w:unhideWhenUsed="1"/>
+    <w:lsdException w:name="Table Contemporary" w:semiHidden="1" w:unhideWhenUsed="1"/>
+    <w:lsdException w:name="Table Elegant" w:semiHidden="1" w:unhideWhenUsed="1"/>
+    <w:lsdException w:name="Table Professional" w:semiHidden="1" w:unhideWhenUsed="1"/>
+    <w:lsdException w:name="Table Subtle 1" w:semiHidden="1" w:unhideWhenUsed="1"/>
+    <w:lsdException w:name="Table Subtle 2" w:semiHidden="1" w:unhideWhenUsed="1"/>
+    <w:lsdException w:name="Table Web 1" w:semiHidden="1" w:unhideWhenUsed="1"/>
+    <w:lsdException w:name="Table Web 2" w:semiHidden="1" w:unhideWhenUsed="1"/>
+    <w:lsdException w:name="Table Web 3" w:semiHidden="1" w:unhideWhenUsed="1"/>
+    <w:lsdException w:name="Balloon Text" w:semiHidden="1" w:unhideWhenUsed="1"/>
+    <w:lsdException w:name="Table Grid" w:uiPriority="59"/>
+    <w:lsdException w:name="Table Theme" w:semiHidden="1" w:unhideWhenUsed="1"/>
+    <w:lsdException w:name="Placeholder Text" w:semiHidden="1"/>
+    <w:lsdException w:name="No Spacing" w:uiPriority="1" w:qFormat="1"/>
+    <w:lsdException w:name="Light Shading" w:uiPriority="60"/>
+    <w:lsdException w:name="Light List" w:uiPriority="61"/>
+    <w:lsdException w:name="Light Grid" w:uiPriority="62"/>
+    <w:lsdException w:name="Medium Shading 1" w:uiPriority="63"/>
+    <w:lsdException w:name="Medium Shading 2" w:uiPriority="64"/>
+    <w:lsdException w:name="Medium List 1" w:uiPriority="65"/>
+    <w:lsdException w:name="Medium List 2" w:uiPriority="66"/>
+    <w:lsdException w:name="Medium Grid 1" w:uiPriority="67"/>
+    <w:lsdException w:name="Medium Grid 2" w:uiPriority="68"/>
+    <w:lsdException w:name="Medium Grid 3" w:uiPriority="69"/>
+    <w:lsdException w:name="Dark List" w:uiPriority="70"/>
+    <w:lsdException w:name="Colorful Shading" w:uiPriority="71"/>
+    <w:lsdException w:name="Colorful List" w:uiPriority="72"/>
+    <w:lsdException w:name="Colorful Grid" w:uiPriority="73"/>
+    <w:lsdException w:name="Light Shading Accent 1" w:uiPriority="60"/>
+    <w:lsdException w:name="Light List Accent 1" w:uiPriority="61"/>
+    <w:lsdException w:name="Light Grid Accent 1" w:uiPriority="62"/>
+    <w:lsdException w:name="Medium Shading 1 Accent 1" w:uiPriority="63"/>
+    <w:lsdException w:name="Medium Shading 2 Accent 1" w:uiPriority="64"/>
+    <w:lsdException w:name="Medium List 1 Accent 1" w:uiPriority="65"/>
+    <w:lsdException w:name="Revision" w:semiHidden="1"/>
+    <w:lsdException w:name="List Paragraph" w:uiPriority="34" w:qFormat="1"/>
+    <w:lsdException w:name="Quote" w:uiPriority="29" w:qFormat="1"/>
+    <w:lsdException w:name="Intense Quote" w:uiPriority="30" w:qFormat="1"/>
+    <w:lsdException w:name="Medium List 2 Accent 1" w:uiPriority="66"/>
+    <w:lsdException w:name="Medium Grid 1 Accent 1" w:uiPriority="67"/>
+    <w:lsdException w:name="Medium Grid 2 Accent 1" w:uiPriority="68"/>
+    <w:lsdException w:name="Medium Grid 3 Accent 1" w:uiPriority="69"/>
+    <w:lsdException w:name="Dark List Accent 1" w:uiPriority="70"/>
+    <w:lsdException w:name="Colorful Shading Accent 1" w:uiPriority="71"/>
+    <w:lsdException w:name="Colorful List Accent 1" w:uiPriority="72"/>
+    <w:lsdException w:name="Colorful Grid Accent 1" w:uiPriority="73"/>
+    <w:lsdException w:name="Light Shading Accent 2" w:uiPriority="60"/>
+    <w:lsdException w:name="Light List Accent 2" w:uiPriority="61"/>
+    <w:lsdException w:name="Light Grid Accent 2" w:uiPriority="62"/>
+    <w:lsdException w:name="Medium Shading 1 Accent 2" w:uiPriority="63"/>
+    <w:lsdException w:name="Medium Shading 2 Accent 2" w:uiPriority="64"/>
+    <w:lsdException w:name="Medium List 1 Accent 2" w:uiPriority="65"/>
+    <w:lsdException w:name="Medium List 2 Accent 2" w:uiPriority="66"/>
+    <w:lsdException w:name="Medium Grid 1 Accent 2" w:uiPriority="67"/>
+    <w:lsdException w:name="Medium Grid 2 Accent 2" w:uiPriority="68"/>
+    <w:lsdException w:name="Medium Grid 3 Accent 2" w:uiPriority="69"/>
+    <w:lsdException w:name="Dark List Accent 2" w:uiPriority="70"/>
+    <w:lsdException w:name="Colorful Shading Accent 2" w:uiPriority="71"/>
+    <w:lsdException w:name="Colorful List Accent 2" w:uiPriority="72"/>
+    <w:lsdException w:name="Colorful Grid Accent 2" w:uiPriority="73"/>
+    <w:lsdException w:name="Light Shading Accent 3" w:uiPriority="60"/>
+    <w:lsdException w:name="Light List Accent 3" w:uiPriority="61"/>
+    <w:lsdException w:name="Light Grid Accent 3" w:uiPriority="62"/>
+    <w:lsdException w:name="Medium Shading 1 Accent 3" w:uiPriority="63"/>
+    <w:lsdException w:name="Medium Shading 2 Accent 3" w:uiPriority="64"/>
+    <w:lsdException w:name="Medium List 1 Accent 3" w:uiPriority="65"/>
+    <w:lsdException w:name="Medium List 2 Accent 3" w:uiPriority="66"/>
+    <w:lsdException w:name="Medium Grid 1 Accent 3" w:uiPriority="67"/>
+    <w:lsdException w:name="Medium Grid 2 Accent 3" w:uiPriority="68"/>
+    <w:lsdException w:name="Medium Grid 3 Accent 3" w:uiPriority="69"/>
+    <w:lsdException w:name="Dark List Accent 3" w:uiPriority="70"/>
+    <w:lsdException w:name="Colorful Shading Accent 3" w:uiPriority="71"/>
+    <w:lsdException w:name="Colorful List Accent 3" w:uiPriority="72"/>
+    <w:lsdException w:name="Colorful Grid Accent 3" w:uiPriority="73"/>
+    <w:lsdException w:name="Light Shading Accent 4" w:uiPriority="60"/>
+    <w:lsdException w:name="Light List Accent 4" w:uiPriority="61"/>
+    <w:lsdException w:name="Light Grid Accent 4" w:uiPriority="62"/>
+    <w:lsdException w:name="Medium Shading 1 Accent 4" w:uiPriority="63"/>
+    <w:lsdException w:name="Medium Shading 2 Accent 4" w:uiPriority="64"/>
+    <w:lsdException w:name="Medium List 1 Accent 4" w:uiPriority="65"/>
+    <w:lsdException w:name="Medium List 2 Accent 4" w:uiPriority="66"/>
+    <w:lsdException w:name="Medium Grid 1 Accent 4" w:uiPriority="67"/>
+    <w:lsdException w:name="Medium Grid 2 Accent 4" w:uiPriority="68"/>
+    <w:lsdException w:name="Medium Grid 3 Accent 4" w:uiPriority="69"/>
+    <w:lsdException w:name="Dark List Accent 4" w:uiPriority="70"/>
+    <w:lsdException w:name="Colorful Shading Accent 4" w:uiPriority="71"/>
+    <w:lsdException w:name="Colorful List Accent 4" w:uiPriority="72"/>
+    <w:lsdException w:name="Colorful Grid Accent 4" w:uiPriority="73"/>
+    <w:lsdException w:name="Light Shading Accent 5" w:uiPriority="60"/>
+    <w:lsdException w:name="Light List Accent 5" w:uiPriority="61"/>
+    <w:lsdException w:name="Light Grid Accent 5" w:uiPriority="62"/>
+    <w:lsdException w:name="Medium Shading 1 Accent 5" w:uiPriority="63"/>
+    <w:lsdException w:name="Medium Shading 2 Accent 5" w:uiPriority="64"/>
+    <w:lsdException w:name="Medium List 1 Accent 5" w:uiPriority="65"/>
+    <w:lsdException w:name="Medium List 2 Accent 5" w:uiPriority="66"/>
+    <w:lsdException w:name="Medium Grid 1 Accent 5" w:uiPriority="67"/>
+    <w:lsdException w:name="Medium Grid 2 Accent 5" w:uiPriority="68"/>
+    <w:lsdException w:name="Medium Grid 3 Accent 5" w:uiPriority="69"/>
+    <w:lsdException w:name="Dark List Accent 5" w:uiPriority="70"/>
+    <w:lsdException w:name="Colorful Shading Accent 5" w:uiPriority="71"/>
+    <w:lsdException w:name="Colorful List Accent 5" w:uiPriority="72"/>
+    <w:lsdException w:name="Colorful Grid Accent 5" w:uiPriority="73"/>
+    <w:lsdException w:name="Light Shading Accent 6" w:uiPriority="60"/>
+    <w:lsdException w:name="Light List Accent 6" w:uiPriority="61"/>
+    <w:lsdException w:name="Light Grid Accent 6" w:uiPriority="62"/>
+    <w:lsdException w:name="Medium Shading 1 Accent 6" w:uiPriority="63"/>
+    <w:lsdException w:name="Medium Shading 2 Accent 6" w:uiPriority="64"/>
+    <w:lsdException w:name="Medium List 1 Accent 6" w:uiPriority="65"/>
+    <w:lsdException w:name="Medium List 2 Accent 6" w:uiPriority="66"/>
+    <w:lsdException w:name="Medium Grid 1 Accent 6" w:uiPriority="67"/>
+    <w:lsdException w:name="Medium Grid 2 Accent 6" w:uiPriority="68"/>
+    <w:lsdException w:name="Medium Grid 3 Accent 6" w:uiPriority="69"/>
+    <w:lsdException w:name="Dark List Accent 6" w:uiPriority="70"/>
+    <w:lsdException w:name="Colorful Shading Accent 6" w:uiPriority="71"/>
+    <w:lsdException w:name="Colorful List Accent 6" w:uiPriority="72"/>
+    <w:lsdException w:name="Colorful Grid Accent 6" w:uiPriority="73"/>
+    <w:lsdException w:name="Subtle Emphasis" w:uiPriority="19" w:qFormat="1"/>
+    <w:lsdException w:name="Intense Emphasis" w:uiPriority="21" w:qFormat="1"/>
+    <w:lsdException w:name="Subtle Reference" w:uiPriority="31" w:qFormat="1"/>
+    <w:lsdException w:name="Intense Reference" w:uiPriority="32" w:qFormat="1"/>
+    <w:lsdException w:name="Book Title" w:uiPriority="33" w:qFormat="1"/>
+    <w:lsdException w:name="Bibliography" w:semiHidden="1" w:uiPriority="37" w:unhideWhenUsed="1"/>
+    <w:lsdException w:name="TOC Heading" w:semiHidden="1" w:uiPriority="39" w:unhideWhenUsed="1" w:qFormat="1"/>
+    <w:lsdException w:name="Plain Table 1" w:uiPriority="41"/>
+    <w:lsdException w:name="Plain Table 2" w:uiPriority="42"/>
+    <w:lsdException w:name="Plain Table 3" w:uiPriority="43"/>
+    <w:lsdException w:name="Plain Table 4" w:uiPriority="44"/>
+    <w:lsdException w:name="Plain Table 5" w:uiPriority="45"/>
+    <w:lsdException w:name="Grid Table Light" w:uiPriority="40"/>
+    <w:lsdException w:name="Grid Table 1 Light" w:uiPriority="46"/>
+    <w:lsdException w:name="Grid Table 2" w:uiPriority="47"/>
+    <w:lsdException w:name="Grid Table 3" w:uiPriority="48"/>
+    <w:lsdException w:name="Grid Table 4" w:uiPriority="49"/>
+    <w:lsdException w:name="Grid Table 5 Dark" w:uiPriority="50"/>
+    <w:lsdException w:name="Grid Table 6 Colorful" w:uiPriority="51"/>
+    <w:lsdException w:name="Grid Table 7 Colorful" w:uiPriority="52"/>
+    <w:lsdException w:name="Grid Table 1 Light Accent 1" w:uiPriority="46"/>
+    <w:lsdException w:name="Grid Table 2 Accent 1" w:uiPriority="47"/>
+    <w:lsdException w:name="Grid Table 3 Accent 1" w:uiPriority="48"/>
+    <w:lsdException w:name="Grid Table 4 Accent 1" w:uiPriority="49"/>
+    <w:lsdException w:name="Grid Table 5 Dark Accent 1" w:uiPriority="50"/>
+    <w:lsdException w:name="Grid Table 6 Colorful Accent 1" w:uiPriority="51"/>
+    <w:lsdException w:name="Grid Table 7 Colorful Accent 1" w:uiPriority="52"/>
+    <w:lsdException w:name="Grid Table 1 Light Accent 2" w:uiPriority="46"/>
+    <w:lsdException w:name="Grid Table 2 Accent 2" w:uiPriority="47"/>
+    <w:lsdException w:name="Grid Table 3 Accent 2" w:uiPriority="48"/>
+    <w:lsdException w:name="Grid Table 4 Accent 2" w:uiPriority="49"/>
+    <w:lsdException w:name="Grid Table 5 Dark Accent 2" w:uiPriority="50"/>
+    <w:lsdException w:name="Grid Table 6 Colorful Accent 2" w:uiPriority="51"/>
+    <w:lsdException w:name="Grid Table 7 Colorful Accent 2" w:uiPriority="52"/>
+    <w:lsdException w:name="Grid Table 1 Light Accent 3" w:uiPriority="46"/>
+    <w:lsdException w:name="Grid Table 2 Accent 3" w:uiPriority="47"/>
+    <w:lsdException w:name="Grid Table 3 Accent 3" w:uiPriority="48"/>
+    <w:lsdException w:name="Grid Table 4 Accent 3" w:uiPriority="49"/>
+    <w:lsdException w:name="Grid Table 5 Dark Accent 3" w:uiPriority="50"/>
+    <w:lsdException w:name="Grid Table 6 Colorful Accent 3" w:uiPriority="51"/>
+    <w:lsdException w:name="Grid Table 7 Colorful Accent 3" w:uiPriority="52"/>
+    <w:lsdException w:name="Grid Table 1 Light Accent 4" w:uiPriority="46"/>
+    <w:lsdException w:name="Grid Table 2 Accent 4" w:uiPriority="47"/>
+    <w:lsdException w:name="Grid Table 3 Accent 4" w:uiPriority="48"/>
+    <w:lsdException w:name="Grid Table 4 Accent 4" w:uiPriority="49"/>
+    <w:lsdException w:name="Grid Table 5 Dark Accent 4" w:uiPriority="50"/>
+    <w:lsdException w:name="Grid Table 6 Colorful Accent 4" w:uiPriority="51"/>
+    <w:lsdException w:name="Grid Table 7 Colorful Accent 4" w:uiPriority="52"/>
+    <w:lsdException w:name="Grid Table 1 Light Accent 5" w:uiPriority="46"/>
+    <w:lsdException w:name="Grid Table 2 Accent 5" w:uiPriority="47"/>
+    <w:lsdException w:name="Grid Table 3 Accent 5" w:uiPriority="48"/>
+    <w:lsdException w:name="Grid Table 4 Accent 5" w:uiPriority="49"/>
+    <w:lsdException w:name="Grid Table 5 Dark Accent 5" w:uiPriority="50"/>
+    <w:lsdException w:name="Grid Table 6 Colorful Accent 5" w:uiPriority="51"/>
+    <w:lsdException w:name="Grid Table 7 Colorful Accent 5" w:uiPriority="52"/>
+    <w:lsdException w:name="Grid Table 1 Light Accent 6" w:uiPriority="46"/>
+    <w:lsdException w:name="Grid Table 2 Accent 6" w:uiPriority="47"/>
+    <w:lsdException w:name="Grid Table 3 Accent 6" w:uiPriority="48"/>
+    <w:lsdException w:name="Grid Table 4 Accent 6" w:uiPriority="49"/>
+    <w:lsdException w:name="Grid Table 5 Dark Accent 6" w:uiPriority="50"/>
+    <w:lsdException w:name="Grid Table 6 Colorful Accent 6" w:uiPriority="51"/>
+    <w:lsdException w:name="Grid Table 7 Colorful Accent 6" w:uiPriority="52"/>
+    <w:lsdException w:name="List Table 1 Light" w:uiPriority="46"/>
+    <w:lsdException w:name="List Table 2" w:uiPriority="47"/>
+    <w:lsdException w:name="List Table 3" w:uiPriority="48"/>
+    <w:lsdException w:name="List Table 4" w:uiPriority="49"/>
+    <w:lsdException w:name="List Table 5 Dark" w:uiPriority="50"/>
+    <w:lsdException w:name="List Table 6 Colorful" w:uiPriority="51"/>
+    <w:lsdException w:name="List Table 7 Colorful" w:uiPriority="52"/>
+    <w:lsdException w:name="List Table 1 Light Accent 1" w:uiPriority="46"/>
+    <w:lsdException w:name="List Table 2 Accent 1" w:uiPriority="47"/>
+    <w:lsdException w:name="List Table 3 Accent 1" w:uiPriority="48"/>
+    <w:lsdException w:name="List Table 4 Accent 1" w:uiPriority="49"/>
+    <w:lsdException w:name="List Table 5 Dark Accent 1" w:uiPriority="50"/>
+    <w:lsdException w:name="List Table 6 Colorful Accent 1" w:uiPriority="51"/>
+    <w:lsdException w:name="List Table 7 Colorful Accent 1" w:uiPriority="52"/>
+    <w:lsdException w:name="List Table 1 Light Accent 2" w:uiPriority="46"/>
+    <w:lsdException w:name="List Table 2 Accent 2" w:uiPriority="47"/>
+    <w:lsdException w:name="List Table 3 Accent 2" w:uiPriority="48"/>
+    <w:lsdException w:name="List Table 4 Accent 2" w:uiPriority="49"/>
+    <w:lsdException w:name="List Table 5 Dark Accent 2" w:uiPriority="50"/>
+    <w:lsdException w:name="List Table 6 Colorful Accent 2" w:uiPriority="51"/>
+    <w:lsdException w:name="List Table 7 Colorful Accent 2" w:uiPriority="52"/>
+    <w:lsdException w:name="List Table 1 Light Accent 3" w:uiPriority="46"/>
+    <w:lsdException w:name="List Table 2 Accent 3" w:uiPriority="47"/>
+    <w:lsdException w:name="List Table 3 Accent 3" w:uiPriority="48"/>
+    <w:lsdException w:name="List Table 4 Accent 3" w:uiPriority="49"/>
+    <w:lsdException w:name="List Table 5 Dark Accent 3" w:uiPriority="50"/>
+    <w:lsdException w:name="List Table 6 Colorful Accent 3" w:uiPriority="51"/>
+    <w:lsdException w:name="List Table 7 Colorful Accent 3" w:uiPriority="52"/>
+    <w:lsdException w:name="List Table 1 Light Accent 4" w:uiPriority="46"/>
+    <w:lsdException w:name="List Table 2 Accent 4" w:uiPriority="47"/>
+    <w:lsdException w:name="List Table 3 Accent 4" w:uiPriority="48"/>
+    <w:lsdException w:name="List Table 4 Accent 4" w:uiPriority="49"/>
+    <w:lsdException w:name="List Table 5 Dark Accent 4" w:uiPriority="50"/>
+    <w:lsdException w:name="List Table 6 Colorful Accent 4" w:uiPriority="51"/>
+    <w:lsdException w:name="List Table 7 Colorful Accent 4" w:uiPriority="52"/>
+    <w:lsdException w:name="List Table 1 Light Accent 5" w:uiPriority="46"/>
+    <w:lsdException w:name="List Table 2 Accent 5" w:uiPriority="47"/>
+    <w:lsdException w:name="List Table 3 Accent 5" w:uiPriority="48"/>
+    <w:lsdException w:name="List Table 4 Accent 5" w:uiPriority="49"/>
+    <w:lsdException w:name="List Table 5 Dark Accent 5" w:uiPriority="50"/>
+    <w:lsdException w:name="List Table 6 Colorful Accent 5" w:uiPriority="51"/>
+    <w:lsdException w:name="List Table 7 Colorful Accent 5" w:uiPriority="52"/>
+    <w:lsdException w:name="List Table 1 Light Accent 6" w:uiPriority="46"/>
+    <w:lsdException w:name="List Table 2 Accent 6" w:uiPriority="47"/>
+    <w:lsdException w:name="List Table 3 Accent 6" w:uiPriority="48"/>
+    <w:lsdException w:name="List Table 4 Accent 6" w:uiPriority="49"/>
+    <w:lsdException w:name="List Table 5 Dark Accent 6" w:uiPriority="50"/>
+    <w:lsdException w:name="List Table 6 Colorful Accent 6" w:uiPriority="51"/>
+    <w:lsdException w:name="List Table 7 Colorful Accent 6" w:uiPriority="52"/>
+    <w:lsdException w:name="Mention" w:semiHidden="1" w:unhideWhenUsed="1"/>
+    <w:lsdException w:name="Smart Hyperlink" w:semiHidden="1" w:unhideWhenUsed="1"/>
+    <w:lsdException w:name="Hashtag" w:semiHidden="1" w:unhideWhenUsed="1"/>
+    <w:lsdException w:name="Unresolved Mention" w:semiHidden="1" w:unhideWhenUsed="1"/>
+    <w:lsdException w:name="Smart Link" w:semiHidden="1" w:unhideWhenUsed="1"/>
   </w:latentStyles>
   <w:style w:type="paragraph" w:default="1" w:styleId="Normal">
     <w:name w:val="Normal"/>

</xml_diff>